<commit_message>
jen ai marre cest tlm long
</commit_message>
<xml_diff>
--- a/S17_Lab1_Instructions.docx
+++ b/S17_Lab1_Instructions.docx
@@ -545,13 +545,7 @@
       </w:r>
       <w:proofErr w:type="gramEnd"/>
       <w:r>
-        <w:t>, on écrit le code UNE</w:t>
-      </w:r>
-      <w:r>
-        <w:t xml:space="preserve"> </w:t>
-      </w:r>
-      <w:r>
-        <w:t xml:space="preserve">SEULE FOIS et il fonctionne pour tous </w:t>
+        <w:t xml:space="preserve">, on écrit le code UNE SEULE FOIS et il fonctionne pour tous </w:t>
       </w:r>
       <w:r>
         <w:t xml:space="preserve">les modèle. </w:t>
@@ -608,11 +602,16 @@
       </w:r>
       <w:proofErr w:type="spellEnd"/>
       <w:r>
-        <w:t>&lt;Zombie</w:t>
+        <w:t>&lt;</w:t>
+      </w:r>
+      <w:proofErr w:type="spellStart"/>
+      <w:r>
+        <w:t>Zombie</w:t>
       </w:r>
       <w:r>
         <w:t>Type</w:t>
       </w:r>
+      <w:proofErr w:type="spellEnd"/>
       <w:proofErr w:type="gramStart"/>
       <w:r>
         <w:t>&gt;  →</w:t>
@@ -953,25 +952,7 @@
           <w:sz w:val="18"/>
           <w:szCs w:val="18"/>
         </w:rPr>
-        <w:t>R</w:t>
-      </w:r>
-      <w:r>
-        <w:rPr>
-          <w:rFonts w:ascii="Consolas" w:hAnsi="Consolas"/>
-          <w:color w:val="00B050"/>
-          <w:sz w:val="18"/>
-          <w:szCs w:val="18"/>
-        </w:rPr>
-        <w:t>etourne T</w:t>
-      </w:r>
-      <w:r>
-        <w:rPr>
-          <w:rFonts w:ascii="Consolas" w:hAnsi="Consolas"/>
-          <w:color w:val="00B050"/>
-          <w:sz w:val="18"/>
-          <w:szCs w:val="18"/>
-        </w:rPr>
-        <w:t xml:space="preserve"> où T est une </w:t>
+        <w:t xml:space="preserve">Retourne T où T est une </w:t>
       </w:r>
       <w:proofErr w:type="spellStart"/>
       <w:r>
@@ -1091,25 +1072,7 @@
           <w:sz w:val="18"/>
           <w:szCs w:val="18"/>
         </w:rPr>
-        <w:t xml:space="preserve">// Pas </w:t>
-      </w:r>
-      <w:r>
-        <w:rPr>
-          <w:rFonts w:ascii="Consolas" w:hAnsi="Consolas"/>
-          <w:color w:val="00B050"/>
-          <w:sz w:val="18"/>
-          <w:szCs w:val="18"/>
-        </w:rPr>
-        <w:t>valeur de retour</w:t>
-      </w:r>
-      <w:r>
-        <w:rPr>
-          <w:rFonts w:ascii="Consolas" w:hAnsi="Consolas"/>
-          <w:color w:val="00B050"/>
-          <w:sz w:val="18"/>
-          <w:szCs w:val="18"/>
-        </w:rPr>
-        <w:t>, supprime l’entité selon le id</w:t>
+        <w:t>// Pas valeur de retour, supprime l’entité selon le id</w:t>
       </w:r>
     </w:p>
     <w:p>
@@ -1204,52 +1167,7 @@
           <w:sz w:val="18"/>
           <w:szCs w:val="18"/>
         </w:rPr>
-        <w:t xml:space="preserve">/ Retourne une </w:t>
-      </w:r>
-      <w:r>
-        <w:rPr>
-          <w:rFonts w:ascii="Consolas" w:hAnsi="Consolas"/>
-          <w:color w:val="00B050"/>
-          <w:sz w:val="18"/>
-          <w:szCs w:val="18"/>
-        </w:rPr>
-        <w:t>liste</w:t>
-      </w:r>
-      <w:r>
-        <w:rPr>
-          <w:rFonts w:ascii="Consolas" w:hAnsi="Consolas"/>
-          <w:color w:val="00B050"/>
-          <w:sz w:val="18"/>
-          <w:szCs w:val="18"/>
-        </w:rPr>
-        <w:t xml:space="preserve"> d’entités</w:t>
-      </w:r>
-      <w:r>
-        <w:rPr>
-          <w:rFonts w:ascii="Consolas" w:hAnsi="Consolas"/>
-          <w:color w:val="00B050"/>
-          <w:sz w:val="18"/>
-          <w:szCs w:val="18"/>
-        </w:rPr>
-        <w:t xml:space="preserve"> en</w:t>
-      </w:r>
-      <w:r>
-        <w:rPr>
-          <w:rFonts w:ascii="Consolas" w:hAnsi="Consolas"/>
-          <w:color w:val="00B050"/>
-          <w:sz w:val="18"/>
-          <w:szCs w:val="18"/>
-        </w:rPr>
-        <w:t xml:space="preserve"> </w:t>
-      </w:r>
-      <w:r>
-        <w:rPr>
-          <w:rFonts w:ascii="Consolas" w:hAnsi="Consolas"/>
-          <w:color w:val="00B050"/>
-          <w:sz w:val="18"/>
-          <w:szCs w:val="18"/>
-        </w:rPr>
-        <w:t>lecture seule</w:t>
+        <w:t>/ Retourne une liste d’entités en lecture seule</w:t>
       </w:r>
     </w:p>
     <w:p>
@@ -1480,34 +1398,7 @@
           <w:sz w:val="18"/>
           <w:szCs w:val="18"/>
         </w:rPr>
-        <w:t xml:space="preserve">// Pas valeur de retour, </w:t>
-      </w:r>
-      <w:r>
-        <w:rPr>
-          <w:rFonts w:ascii="Consolas" w:hAnsi="Consolas"/>
-          <w:color w:val="00B050"/>
-          <w:sz w:val="18"/>
-          <w:szCs w:val="18"/>
-        </w:rPr>
-        <w:t>édite</w:t>
-      </w:r>
-      <w:r>
-        <w:rPr>
-          <w:rFonts w:ascii="Consolas" w:hAnsi="Consolas"/>
-          <w:color w:val="00B050"/>
-          <w:sz w:val="18"/>
-          <w:szCs w:val="18"/>
-        </w:rPr>
-        <w:t xml:space="preserve"> l’entité</w:t>
-      </w:r>
-      <w:r>
-        <w:rPr>
-          <w:rFonts w:ascii="Consolas" w:hAnsi="Consolas"/>
-          <w:color w:val="00B050"/>
-          <w:sz w:val="18"/>
-          <w:szCs w:val="18"/>
-        </w:rPr>
-        <w:t>.</w:t>
+        <w:t>// Pas valeur de retour, édite l’entité.</w:t>
       </w:r>
     </w:p>
     <w:p>
@@ -1982,7 +1873,6 @@
         <w:spacing w:before="0" w:after="0"/>
         <w:rPr>
           <w:rFonts w:ascii="Consolas" w:hAnsi="Consolas"/>
-          <w:lang w:val="en-CA"/>
         </w:rPr>
       </w:pPr>
       <w:r>
@@ -1991,18 +1881,20 @@
         </w:rPr>
         <w:t xml:space="preserve">    </w:t>
       </w:r>
+      <w:proofErr w:type="spellStart"/>
+      <w:proofErr w:type="gramStart"/>
       <w:r>
         <w:rPr>
           <w:rFonts w:ascii="Consolas" w:hAnsi="Consolas"/>
           <w:color w:val="0000FF"/>
-          <w:lang w:val="en-CA"/>
         </w:rPr>
         <w:t>protected</w:t>
       </w:r>
-      <w:r>
-        <w:rPr>
-          <w:rFonts w:ascii="Consolas" w:hAnsi="Consolas"/>
-          <w:lang w:val="en-CA"/>
+      <w:proofErr w:type="spellEnd"/>
+      <w:proofErr w:type="gramEnd"/>
+      <w:r>
+        <w:rPr>
+          <w:rFonts w:ascii="Consolas" w:hAnsi="Consolas"/>
         </w:rPr>
         <w:t xml:space="preserve"> </w:t>
       </w:r>
@@ -2011,7 +1903,6 @@
         <w:rPr>
           <w:rFonts w:ascii="Consolas" w:hAnsi="Consolas"/>
           <w:color w:val="0000FF"/>
-          <w:lang w:val="en-CA"/>
         </w:rPr>
         <w:t>readonly</w:t>
       </w:r>
@@ -2019,7 +1910,6 @@
       <w:r>
         <w:rPr>
           <w:rFonts w:ascii="Consolas" w:hAnsi="Consolas"/>
-          <w:lang w:val="en-CA"/>
         </w:rPr>
         <w:t xml:space="preserve"> </w:t>
       </w:r>
@@ -2027,7 +1917,6 @@
       <w:r>
         <w:rPr>
           <w:rFonts w:ascii="Consolas" w:hAnsi="Consolas"/>
-          <w:lang w:val="en-CA"/>
         </w:rPr>
         <w:t>ZombiePartyDbContext</w:t>
       </w:r>
@@ -2035,7 +1924,6 @@
       <w:r>
         <w:rPr>
           <w:rFonts w:ascii="Consolas" w:hAnsi="Consolas"/>
-          <w:lang w:val="en-CA"/>
         </w:rPr>
         <w:t xml:space="preserve"> _</w:t>
       </w:r>
@@ -2043,7 +1931,6 @@
       <w:r>
         <w:rPr>
           <w:rFonts w:ascii="Consolas" w:hAnsi="Consolas"/>
-          <w:lang w:val="en-CA"/>
         </w:rPr>
         <w:t>dbContext</w:t>
       </w:r>
@@ -2051,7 +1938,6 @@
       <w:r>
         <w:rPr>
           <w:rFonts w:ascii="Consolas" w:hAnsi="Consolas"/>
-          <w:lang w:val="en-CA"/>
         </w:rPr>
         <w:t>;</w:t>
       </w:r>
@@ -2073,7 +1959,6 @@
         <w:spacing w:before="0" w:after="0"/>
         <w:rPr>
           <w:rFonts w:ascii="Consolas" w:hAnsi="Consolas"/>
-          <w:lang w:val="en-CA"/>
         </w:rPr>
       </w:pPr>
     </w:p>
@@ -2094,28 +1979,26 @@
         <w:spacing w:before="0" w:after="0"/>
         <w:rPr>
           <w:rFonts w:ascii="Consolas" w:hAnsi="Consolas"/>
-          <w:lang w:val="en-CA"/>
-        </w:rPr>
-      </w:pPr>
-      <w:r>
-        <w:rPr>
-          <w:rFonts w:ascii="Consolas" w:hAnsi="Consolas"/>
-          <w:lang w:val="en-CA"/>
+        </w:rPr>
+      </w:pPr>
+      <w:r>
+        <w:rPr>
+          <w:rFonts w:ascii="Consolas" w:hAnsi="Consolas"/>
         </w:rPr>
         <w:t xml:space="preserve">    </w:t>
       </w:r>
+      <w:proofErr w:type="gramStart"/>
       <w:r>
         <w:rPr>
           <w:rFonts w:ascii="Consolas" w:hAnsi="Consolas"/>
           <w:color w:val="0000FF"/>
-          <w:lang w:val="en-CA"/>
         </w:rPr>
         <w:t>public</w:t>
       </w:r>
-      <w:r>
-        <w:rPr>
-          <w:rFonts w:ascii="Consolas" w:hAnsi="Consolas"/>
-          <w:lang w:val="en-CA"/>
+      <w:proofErr w:type="gramEnd"/>
+      <w:r>
+        <w:rPr>
+          <w:rFonts w:ascii="Consolas" w:hAnsi="Consolas"/>
         </w:rPr>
         <w:t xml:space="preserve"> </w:t>
       </w:r>
@@ -2125,7 +2008,6 @@
         <w:rPr>
           <w:rFonts w:ascii="Consolas" w:hAnsi="Consolas"/>
           <w:color w:val="2B91AF"/>
-          <w:lang w:val="en-CA"/>
         </w:rPr>
         <w:t>ServiceBaseAsync</w:t>
       </w:r>
@@ -2133,7 +2015,6 @@
       <w:r>
         <w:rPr>
           <w:rFonts w:ascii="Consolas" w:hAnsi="Consolas"/>
-          <w:lang w:val="en-CA"/>
         </w:rPr>
         <w:t>(</w:t>
       </w:r>
@@ -2142,7 +2023,6 @@
       <w:r>
         <w:rPr>
           <w:rFonts w:ascii="Consolas" w:hAnsi="Consolas"/>
-          <w:lang w:val="en-CA"/>
         </w:rPr>
         <w:t>ZombiePartyDbContext</w:t>
       </w:r>
@@ -2150,7 +2030,6 @@
       <w:r>
         <w:rPr>
           <w:rFonts w:ascii="Consolas" w:hAnsi="Consolas"/>
-          <w:lang w:val="en-CA"/>
         </w:rPr>
         <w:t xml:space="preserve"> </w:t>
       </w:r>
@@ -2158,7 +2037,6 @@
       <w:r>
         <w:rPr>
           <w:rFonts w:ascii="Consolas" w:hAnsi="Consolas"/>
-          <w:lang w:val="en-CA"/>
         </w:rPr>
         <w:t>dbContext</w:t>
       </w:r>
@@ -2166,7 +2044,6 @@
       <w:r>
         <w:rPr>
           <w:rFonts w:ascii="Consolas" w:hAnsi="Consolas"/>
-          <w:lang w:val="en-CA"/>
         </w:rPr>
         <w:t>)</w:t>
       </w:r>
@@ -2188,23 +2065,14 @@
         <w:spacing w:before="0" w:after="0"/>
         <w:rPr>
           <w:rFonts w:ascii="Consolas" w:hAnsi="Consolas"/>
-          <w:lang w:val="en-US"/>
-        </w:rPr>
-      </w:pPr>
-      <w:r>
-        <w:rPr>
-          <w:rFonts w:ascii="Consolas" w:hAnsi="Consolas"/>
-          <w:lang w:val="en-CA"/>
+        </w:rPr>
+      </w:pPr>
+      <w:r>
+        <w:rPr>
+          <w:rFonts w:ascii="Consolas" w:hAnsi="Consolas"/>
         </w:rPr>
         <w:lastRenderedPageBreak/>
-        <w:t xml:space="preserve">    </w:t>
-      </w:r>
-      <w:r>
-        <w:rPr>
-          <w:rFonts w:ascii="Consolas" w:hAnsi="Consolas"/>
-          <w:lang w:val="en-US"/>
-        </w:rPr>
-        <w:t>{</w:t>
+        <w:t xml:space="preserve">    {</w:t>
       </w:r>
     </w:p>
     <w:p>
@@ -2229,7 +2097,6 @@
       <w:r>
         <w:rPr>
           <w:rFonts w:ascii="Consolas" w:hAnsi="Consolas"/>
-          <w:lang w:val="en-US"/>
         </w:rPr>
         <w:t xml:space="preserve">        </w:t>
       </w:r>
@@ -2886,152 +2753,117 @@
           <w:rFonts w:ascii="Consolas" w:hAnsi="Consolas"/>
           <w:color w:val="00B050"/>
         </w:rPr>
+        <w:t xml:space="preserve"> Set&lt;T</w:t>
+      </w:r>
+      <w:proofErr w:type="gramStart"/>
+      <w:r>
+        <w:rPr>
+          <w:rFonts w:ascii="Consolas" w:hAnsi="Consolas"/>
+          <w:color w:val="00B050"/>
+        </w:rPr>
+        <w:t>&gt;(</w:t>
+      </w:r>
+      <w:proofErr w:type="gramEnd"/>
+      <w:r>
+        <w:rPr>
+          <w:rFonts w:ascii="Consolas" w:hAnsi="Consolas"/>
+          <w:color w:val="00B050"/>
+        </w:rPr>
+        <w:t xml:space="preserve">) retournera le </w:t>
+      </w:r>
+      <w:proofErr w:type="spellStart"/>
+      <w:r>
+        <w:rPr>
+          <w:rFonts w:ascii="Consolas" w:hAnsi="Consolas"/>
+          <w:color w:val="00B050"/>
+        </w:rPr>
+        <w:t>DbSet</w:t>
+      </w:r>
+      <w:proofErr w:type="spellEnd"/>
+      <w:r>
+        <w:rPr>
+          <w:rFonts w:ascii="Consolas" w:hAnsi="Consolas"/>
+          <w:color w:val="00B050"/>
+        </w:rPr>
+        <w:t xml:space="preserve"> Zombies</w:t>
+      </w:r>
+      <w:r>
+        <w:rPr>
+          <w:rFonts w:ascii="Consolas" w:hAnsi="Consolas"/>
+          <w:color w:val="00B050"/>
+        </w:rPr>
+        <w:t>. L</w:t>
+      </w:r>
+      <w:r>
+        <w:rPr>
+          <w:rFonts w:ascii="Consolas" w:hAnsi="Consolas"/>
+          <w:color w:val="00B050"/>
+        </w:rPr>
+        <w:t>e résultat sera</w:t>
+      </w:r>
+      <w:r>
+        <w:rPr>
+          <w:rFonts w:ascii="Consolas" w:hAnsi="Consolas"/>
+          <w:color w:val="00B050"/>
+        </w:rPr>
+        <w:t> :</w:t>
+      </w:r>
+      <w:r>
+        <w:rPr>
+          <w:rFonts w:ascii="Consolas" w:hAnsi="Consolas"/>
+          <w:color w:val="00B050"/>
+        </w:rPr>
         <w:t xml:space="preserve"> </w:t>
       </w:r>
+      <w:proofErr w:type="spellStart"/>
       <w:r>
         <w:rPr>
           <w:rFonts w:ascii="Consolas" w:hAnsi="Consolas"/>
           <w:color w:val="00B050"/>
         </w:rPr>
-        <w:t>Set&lt;T</w:t>
-      </w:r>
+        <w:t>await</w:t>
+      </w:r>
+      <w:proofErr w:type="spellEnd"/>
+      <w:r>
+        <w:rPr>
+          <w:rFonts w:ascii="Consolas" w:hAnsi="Consolas"/>
+          <w:color w:val="00B050"/>
+        </w:rPr>
+        <w:t xml:space="preserve"> _</w:t>
+      </w:r>
+      <w:proofErr w:type="spellStart"/>
       <w:proofErr w:type="gramStart"/>
       <w:r>
         <w:rPr>
           <w:rFonts w:ascii="Consolas" w:hAnsi="Consolas"/>
           <w:color w:val="00B050"/>
         </w:rPr>
-        <w:t>&gt;(</w:t>
-      </w:r>
+        <w:t>dbContext.Zombies.AddAsync</w:t>
+      </w:r>
+      <w:proofErr w:type="spellEnd"/>
       <w:proofErr w:type="gramEnd"/>
       <w:r>
         <w:rPr>
           <w:rFonts w:ascii="Consolas" w:hAnsi="Consolas"/>
           <w:color w:val="00B050"/>
         </w:rPr>
-        <w:t>)</w:t>
-      </w:r>
+        <w:t>(</w:t>
+      </w:r>
+      <w:proofErr w:type="spellStart"/>
       <w:r>
         <w:rPr>
           <w:rFonts w:ascii="Consolas" w:hAnsi="Consolas"/>
           <w:color w:val="00B050"/>
         </w:rPr>
-        <w:t xml:space="preserve"> retournera le </w:t>
-      </w:r>
-      <w:proofErr w:type="spellStart"/>
+        <w:t>entity</w:t>
+      </w:r>
+      <w:proofErr w:type="spellEnd"/>
       <w:r>
         <w:rPr>
           <w:rFonts w:ascii="Consolas" w:hAnsi="Consolas"/>
           <w:color w:val="00B050"/>
         </w:rPr>
-        <w:t>DbSet</w:t>
-      </w:r>
-      <w:proofErr w:type="spellEnd"/>
-      <w:r>
-        <w:rPr>
-          <w:rFonts w:ascii="Consolas" w:hAnsi="Consolas"/>
-          <w:color w:val="00B050"/>
-        </w:rPr>
-        <w:t xml:space="preserve"> Zombies</w:t>
-      </w:r>
-      <w:r>
-        <w:rPr>
-          <w:rFonts w:ascii="Consolas" w:hAnsi="Consolas"/>
-          <w:color w:val="00B050"/>
-        </w:rPr>
-        <w:t>. L</w:t>
-      </w:r>
-      <w:r>
-        <w:rPr>
-          <w:rFonts w:ascii="Consolas" w:hAnsi="Consolas"/>
-          <w:color w:val="00B050"/>
-        </w:rPr>
-        <w:t>e résultat sera</w:t>
-      </w:r>
-      <w:r>
-        <w:rPr>
-          <w:rFonts w:ascii="Consolas" w:hAnsi="Consolas"/>
-          <w:color w:val="00B050"/>
-        </w:rPr>
-        <w:t> :</w:t>
-      </w:r>
-      <w:r>
-        <w:rPr>
-          <w:rFonts w:ascii="Consolas" w:hAnsi="Consolas"/>
-          <w:color w:val="00B050"/>
-        </w:rPr>
-        <w:t xml:space="preserve"> </w:t>
-      </w:r>
-      <w:proofErr w:type="spellStart"/>
-      <w:r>
-        <w:rPr>
-          <w:rFonts w:ascii="Consolas" w:hAnsi="Consolas"/>
-          <w:color w:val="00B050"/>
-        </w:rPr>
-        <w:t>await</w:t>
-      </w:r>
-      <w:proofErr w:type="spellEnd"/>
-      <w:r>
-        <w:rPr>
-          <w:rFonts w:ascii="Consolas" w:hAnsi="Consolas"/>
-          <w:color w:val="00B050"/>
-        </w:rPr>
-        <w:t xml:space="preserve"> _</w:t>
-      </w:r>
-      <w:proofErr w:type="spellStart"/>
-      <w:proofErr w:type="gramStart"/>
-      <w:r>
-        <w:rPr>
-          <w:rFonts w:ascii="Consolas" w:hAnsi="Consolas"/>
-          <w:color w:val="00B050"/>
-        </w:rPr>
-        <w:t>dbContext.</w:t>
-      </w:r>
-      <w:r>
-        <w:rPr>
-          <w:rFonts w:ascii="Consolas" w:hAnsi="Consolas"/>
-          <w:color w:val="00B050"/>
-        </w:rPr>
-        <w:t>Zombies.</w:t>
-      </w:r>
-      <w:r>
-        <w:rPr>
-          <w:rFonts w:ascii="Consolas" w:hAnsi="Consolas"/>
-          <w:color w:val="00B050"/>
-        </w:rPr>
-        <w:t>AddAsync</w:t>
-      </w:r>
-      <w:proofErr w:type="spellEnd"/>
-      <w:proofErr w:type="gramEnd"/>
-      <w:r>
-        <w:rPr>
-          <w:rFonts w:ascii="Consolas" w:hAnsi="Consolas"/>
-          <w:color w:val="00B050"/>
-        </w:rPr>
-        <w:t>(</w:t>
-      </w:r>
-      <w:proofErr w:type="spellStart"/>
-      <w:r>
-        <w:rPr>
-          <w:rFonts w:ascii="Consolas" w:hAnsi="Consolas"/>
-          <w:color w:val="00B050"/>
-        </w:rPr>
-        <w:t>entity</w:t>
-      </w:r>
-      <w:proofErr w:type="spellEnd"/>
-      <w:r>
-        <w:rPr>
-          <w:rFonts w:ascii="Consolas" w:hAnsi="Consolas"/>
-          <w:color w:val="00B050"/>
-        </w:rPr>
-        <w:t>);</w:t>
-      </w:r>
-      <w:r>
-        <w:rPr>
-          <w:rFonts w:ascii="Consolas" w:hAnsi="Consolas"/>
-          <w:color w:val="00B050"/>
-        </w:rPr>
-        <w:t xml:space="preserve"> */</w:t>
+        <w:t>); */</w:t>
       </w:r>
     </w:p>
     <w:p>
@@ -3487,13 +3319,11 @@
         <w:spacing w:before="0" w:after="0"/>
         <w:rPr>
           <w:rFonts w:ascii="Consolas" w:hAnsi="Consolas"/>
-          <w:lang w:val="en-CA"/>
-        </w:rPr>
-      </w:pPr>
-      <w:r>
-        <w:rPr>
-          <w:rFonts w:ascii="Consolas" w:hAnsi="Consolas"/>
-          <w:lang w:val="en-CA"/>
+        </w:rPr>
+      </w:pPr>
+      <w:r>
+        <w:rPr>
+          <w:rFonts w:ascii="Consolas" w:hAnsi="Consolas"/>
         </w:rPr>
         <w:t>{</w:t>
       </w:r>
@@ -3523,102 +3353,39 @@
           <w:rFonts w:ascii="Consolas" w:hAnsi="Consolas"/>
           <w:color w:val="00B050"/>
         </w:rPr>
-        <w:t xml:space="preserve">/* </w:t>
-      </w:r>
+        <w:t xml:space="preserve">/* On appelle d'abord </w:t>
+      </w:r>
+      <w:proofErr w:type="spellStart"/>
       <w:r>
         <w:rPr>
           <w:rFonts w:ascii="Consolas" w:hAnsi="Consolas"/>
           <w:color w:val="00B050"/>
         </w:rPr>
-        <w:t xml:space="preserve">On appelle d'abord </w:t>
-      </w:r>
-      <w:proofErr w:type="spellStart"/>
+        <w:t>GetByIdAsync</w:t>
+      </w:r>
+      <w:proofErr w:type="spellEnd"/>
       <w:r>
         <w:rPr>
           <w:rFonts w:ascii="Consolas" w:hAnsi="Consolas"/>
           <w:color w:val="00B050"/>
         </w:rPr>
-        <w:t>GetByIdAsync</w:t>
-      </w:r>
-      <w:proofErr w:type="spellEnd"/>
+        <w:t xml:space="preserve"> (méthode présentée au bas de la page) pour vérifier que l'entité existe. Si elle n'existe pas (</w:t>
+      </w:r>
+      <w:proofErr w:type="spellStart"/>
       <w:r>
         <w:rPr>
           <w:rFonts w:ascii="Consolas" w:hAnsi="Consolas"/>
           <w:color w:val="00B050"/>
         </w:rPr>
-        <w:t xml:space="preserve"> (méthode </w:t>
-      </w:r>
+        <w:t>null</w:t>
+      </w:r>
+      <w:proofErr w:type="spellEnd"/>
       <w:r>
         <w:rPr>
           <w:rFonts w:ascii="Consolas" w:hAnsi="Consolas"/>
           <w:color w:val="00B050"/>
         </w:rPr>
-        <w:t xml:space="preserve">présentée </w:t>
-      </w:r>
-      <w:r>
-        <w:rPr>
-          <w:rFonts w:ascii="Consolas" w:hAnsi="Consolas"/>
-          <w:color w:val="00B050"/>
-        </w:rPr>
-        <w:t>au</w:t>
-      </w:r>
-      <w:r>
-        <w:rPr>
-          <w:rFonts w:ascii="Consolas" w:hAnsi="Consolas"/>
-          <w:color w:val="00B050"/>
-        </w:rPr>
-        <w:t xml:space="preserve"> bas</w:t>
-      </w:r>
-      <w:r>
-        <w:rPr>
-          <w:rFonts w:ascii="Consolas" w:hAnsi="Consolas"/>
-          <w:color w:val="00B050"/>
-        </w:rPr>
-        <w:t xml:space="preserve"> de la page)</w:t>
-      </w:r>
-      <w:r>
-        <w:rPr>
-          <w:rFonts w:ascii="Consolas" w:hAnsi="Consolas"/>
-          <w:color w:val="00B050"/>
-        </w:rPr>
-        <w:t xml:space="preserve"> pour vérifier que l'entité existe.</w:t>
-      </w:r>
-      <w:r>
-        <w:rPr>
-          <w:rFonts w:ascii="Consolas" w:hAnsi="Consolas"/>
-          <w:color w:val="00B050"/>
-        </w:rPr>
-        <w:t xml:space="preserve"> </w:t>
-      </w:r>
-      <w:r>
-        <w:rPr>
-          <w:rFonts w:ascii="Consolas" w:hAnsi="Consolas"/>
-          <w:color w:val="00B050"/>
-        </w:rPr>
-        <w:t>Si elle n'existe pas (</w:t>
-      </w:r>
-      <w:proofErr w:type="spellStart"/>
-      <w:r>
-        <w:rPr>
-          <w:rFonts w:ascii="Consolas" w:hAnsi="Consolas"/>
-          <w:color w:val="00B050"/>
-        </w:rPr>
-        <w:t>null</w:t>
-      </w:r>
-      <w:proofErr w:type="spellEnd"/>
-      <w:r>
-        <w:rPr>
-          <w:rFonts w:ascii="Consolas" w:hAnsi="Consolas"/>
-          <w:color w:val="00B050"/>
-        </w:rPr>
-        <w:t>), rien ne se passe</w:t>
-      </w:r>
-      <w:r>
-        <w:rPr>
-          <w:rFonts w:ascii="Consolas" w:hAnsi="Consolas"/>
-          <w:color w:val="00B050"/>
-        </w:rPr>
-        <w:t xml:space="preserve">. Sinon l’entité est supprimée */ </w:t>
+        <w:t xml:space="preserve">), rien ne se passe. Sinon l’entité est supprimée */ </w:t>
       </w:r>
     </w:p>
     <w:p>
@@ -4238,23 +4005,23 @@
           <w:rFonts w:ascii="Consolas" w:hAnsi="Consolas"/>
           <w:color w:val="00B050"/>
         </w:rPr>
-        <w:t xml:space="preserve"> et </w:t>
-      </w:r>
-      <w:r>
-        <w:rPr>
-          <w:rFonts w:ascii="Consolas" w:hAnsi="Consolas"/>
+        <w:t xml:space="preserve"> et il garde en mémoire des informations sur </w:t>
+      </w:r>
+      <w:r>
+        <w:rPr>
+          <w:rFonts w:ascii="Consolas" w:hAnsi="Consolas"/>
+          <w:b/>
+          <w:bCs/>
           <w:color w:val="00B050"/>
         </w:rPr>
-        <w:t xml:space="preserve">il garde en mémoire des informations sur </w:t>
-      </w:r>
-      <w:r>
-        <w:rPr>
-          <w:rFonts w:ascii="Consolas" w:hAnsi="Consolas"/>
-          <w:b/>
-          <w:bCs/>
+        <w:t>l'état (state)</w:t>
+      </w:r>
+      <w:r>
+        <w:rPr>
+          <w:rFonts w:ascii="Consolas" w:hAnsi="Consolas"/>
           <w:color w:val="00B050"/>
         </w:rPr>
-        <w:t>l'état</w:t>
+        <w:t xml:space="preserve"> de ces objets. </w:t>
       </w:r>
       <w:r>
         <w:rPr>
@@ -4263,13 +4030,98 @@
           <w:bCs/>
           <w:color w:val="00B050"/>
         </w:rPr>
-        <w:t xml:space="preserve"> (state)</w:t>
-      </w:r>
-      <w:r>
-        <w:rPr>
-          <w:rFonts w:ascii="Consolas" w:hAnsi="Consolas"/>
+        <w:t>Entry(</w:t>
+      </w:r>
+      <w:proofErr w:type="spellStart"/>
+      <w:r>
+        <w:rPr>
+          <w:rFonts w:ascii="Consolas" w:hAnsi="Consolas"/>
+          <w:b/>
+          <w:bCs/>
           <w:color w:val="00B050"/>
         </w:rPr>
+        <w:t>entity</w:t>
+      </w:r>
+      <w:proofErr w:type="spellEnd"/>
+      <w:proofErr w:type="gramStart"/>
+      <w:r>
+        <w:rPr>
+          <w:rFonts w:ascii="Consolas" w:hAnsi="Consolas"/>
+          <w:b/>
+          <w:bCs/>
+          <w:color w:val="00B050"/>
+        </w:rPr>
+        <w:t>).State</w:t>
+      </w:r>
+      <w:proofErr w:type="gramEnd"/>
+      <w:r>
+        <w:rPr>
+          <w:rFonts w:ascii="Consolas" w:hAnsi="Consolas"/>
+          <w:color w:val="00B050"/>
+        </w:rPr>
+        <w:t xml:space="preserve"> permet d’accéder à cet état. </w:t>
+      </w:r>
+      <w:r>
+        <w:rPr>
+          <w:rFonts w:ascii="Consolas" w:hAnsi="Consolas"/>
+          <w:color w:val="00B050"/>
+        </w:rPr>
+        <w:t>Quand</w:t>
+      </w:r>
+      <w:r>
+        <w:rPr>
+          <w:rFonts w:ascii="Consolas" w:hAnsi="Consolas"/>
+          <w:color w:val="00B050"/>
+        </w:rPr>
+        <w:t xml:space="preserve"> l’objet</w:t>
+      </w:r>
+      <w:r>
+        <w:rPr>
+          <w:rFonts w:ascii="Consolas" w:hAnsi="Consolas"/>
+          <w:color w:val="00B050"/>
+        </w:rPr>
+        <w:t xml:space="preserve"> provient d'un formulaire HTML</w:t>
+      </w:r>
+      <w:r>
+        <w:rPr>
+          <w:rFonts w:ascii="Consolas" w:hAnsi="Consolas"/>
+          <w:color w:val="00B050"/>
+        </w:rPr>
+        <w:t xml:space="preserve"> via une requête POST par exemple</w:t>
+      </w:r>
+      <w:r>
+        <w:rPr>
+          <w:rFonts w:ascii="Consolas" w:hAnsi="Consolas"/>
+          <w:color w:val="00B050"/>
+        </w:rPr>
+        <w:t xml:space="preserve">, </w:t>
+      </w:r>
+      <w:r>
+        <w:rPr>
+          <w:rFonts w:ascii="Consolas" w:hAnsi="Consolas"/>
+          <w:color w:val="00B050"/>
+        </w:rPr>
+        <w:t>il</w:t>
+      </w:r>
+      <w:r>
+        <w:rPr>
+          <w:rFonts w:ascii="Consolas" w:hAnsi="Consolas"/>
+          <w:color w:val="00B050"/>
+        </w:rPr>
+        <w:t xml:space="preserve"> N'EST PAS tracké</w:t>
+      </w:r>
+      <w:r>
+        <w:rPr>
+          <w:rFonts w:ascii="Consolas" w:hAnsi="Consolas"/>
+          <w:color w:val="00B050"/>
+        </w:rPr>
+        <w:t xml:space="preserve"> par EF.</w:t>
+      </w:r>
+      <w:r>
+        <w:rPr>
+          <w:rFonts w:ascii="Consolas" w:hAnsi="Consolas"/>
+          <w:color w:val="00B050"/>
+        </w:rPr>
         <w:t xml:space="preserve"> </w:t>
       </w:r>
       <w:r>
@@ -4277,21 +4129,21 @@
           <w:rFonts w:ascii="Consolas" w:hAnsi="Consolas"/>
           <w:color w:val="00B050"/>
         </w:rPr>
-        <w:t xml:space="preserve">de ces </w:t>
+        <w:t>S</w:t>
       </w:r>
       <w:r>
         <w:rPr>
           <w:rFonts w:ascii="Consolas" w:hAnsi="Consolas"/>
           <w:color w:val="00B050"/>
         </w:rPr>
-        <w:t>objet</w:t>
+        <w:t>on</w:t>
       </w:r>
       <w:r>
         <w:rPr>
           <w:rFonts w:ascii="Consolas" w:hAnsi="Consolas"/>
           <w:color w:val="00B050"/>
         </w:rPr>
-        <w:t xml:space="preserve">s. </w:t>
+        <w:t xml:space="preserve"> </w:t>
       </w:r>
       <w:r>
         <w:rPr>
@@ -4300,9 +4152,8 @@
           <w:bCs/>
           <w:color w:val="00B050"/>
         </w:rPr>
-        <w:t>Entry(</w:t>
-      </w:r>
-      <w:proofErr w:type="spellStart"/>
+        <w:t>état</w:t>
+      </w:r>
       <w:r>
         <w:rPr>
           <w:rFonts w:ascii="Consolas" w:hAnsi="Consolas"/>
@@ -4310,18 +4161,156 @@
           <w:bCs/>
           <w:color w:val="00B050"/>
         </w:rPr>
-        <w:t>entity</w:t>
-      </w:r>
-      <w:proofErr w:type="spellEnd"/>
+        <w:t xml:space="preserve"> </w:t>
+      </w:r>
+      <w:r>
+        <w:rPr>
+          <w:rFonts w:ascii="Consolas" w:hAnsi="Consolas"/>
+          <w:b/>
+          <w:bCs/>
+          <w:color w:val="00B050"/>
+        </w:rPr>
+        <w:t>(</w:t>
+      </w:r>
+      <w:r>
+        <w:rPr>
+          <w:rFonts w:ascii="Consolas" w:hAnsi="Consolas"/>
+          <w:b/>
+          <w:bCs/>
+          <w:color w:val="00B050"/>
+        </w:rPr>
+        <w:t>state</w:t>
+      </w:r>
+      <w:r>
+        <w:rPr>
+          <w:rFonts w:ascii="Consolas" w:hAnsi="Consolas"/>
+          <w:b/>
+          <w:bCs/>
+          <w:color w:val="00B050"/>
+        </w:rPr>
+        <w:t>)</w:t>
+      </w:r>
+      <w:r>
+        <w:rPr>
+          <w:rFonts w:ascii="Consolas" w:hAnsi="Consolas"/>
+          <w:b/>
+          <w:bCs/>
+          <w:color w:val="00B050"/>
+        </w:rPr>
+        <w:t xml:space="preserve"> </w:t>
+      </w:r>
+      <w:r>
+        <w:rPr>
+          <w:rFonts w:ascii="Consolas" w:hAnsi="Consolas"/>
+          <w:color w:val="00B050"/>
+        </w:rPr>
+        <w:t>est</w:t>
+      </w:r>
+      <w:r>
+        <w:rPr>
+          <w:rFonts w:ascii="Consolas" w:hAnsi="Consolas"/>
+          <w:color w:val="00B050"/>
+        </w:rPr>
+        <w:t xml:space="preserve"> alors</w:t>
+      </w:r>
+      <w:r>
+        <w:rPr>
+          <w:rFonts w:ascii="Consolas" w:hAnsi="Consolas"/>
+          <w:color w:val="00B050"/>
+        </w:rPr>
+        <w:t xml:space="preserve"> </w:t>
+      </w:r>
+      <w:proofErr w:type="spellStart"/>
+      <w:r>
+        <w:rPr>
+          <w:rFonts w:ascii="Consolas" w:hAnsi="Consolas"/>
+          <w:b/>
+          <w:bCs/>
+          <w:color w:val="00B050"/>
+        </w:rPr>
+        <w:t>Detached</w:t>
+      </w:r>
+      <w:proofErr w:type="spellEnd"/>
+      <w:r>
+        <w:rPr>
+          <w:rFonts w:ascii="Consolas" w:hAnsi="Consolas"/>
+          <w:b/>
+          <w:bCs/>
+          <w:color w:val="00B050"/>
+        </w:rPr>
+        <w:t xml:space="preserve"> (</w:t>
+      </w:r>
+      <w:proofErr w:type="spellStart"/>
+      <w:r>
+        <w:rPr>
+          <w:rFonts w:ascii="Consolas" w:hAnsi="Consolas"/>
+          <w:b/>
+          <w:bCs/>
+          <w:color w:val="00B050"/>
+        </w:rPr>
+        <w:t>EntityState.Detached</w:t>
+      </w:r>
+      <w:proofErr w:type="spellEnd"/>
+      <w:r>
+        <w:rPr>
+          <w:rFonts w:ascii="Consolas" w:hAnsi="Consolas"/>
+          <w:b/>
+          <w:bCs/>
+          <w:color w:val="00B050"/>
+        </w:rPr>
+        <w:t>)</w:t>
+      </w:r>
+      <w:r>
+        <w:rPr>
+          <w:rFonts w:ascii="Consolas" w:hAnsi="Consolas"/>
+          <w:color w:val="00B050"/>
+        </w:rPr>
+        <w:t>.</w:t>
+      </w:r>
+      <w:r>
+        <w:rPr>
+          <w:rFonts w:ascii="Consolas" w:hAnsi="Consolas"/>
+          <w:color w:val="00B050"/>
+        </w:rPr>
+        <w:t xml:space="preserve"> Dans ce cas-ci, (if est </w:t>
+      </w:r>
+      <w:proofErr w:type="spellStart"/>
+      <w:r>
+        <w:rPr>
+          <w:rFonts w:ascii="Consolas" w:hAnsi="Consolas"/>
+          <w:color w:val="00B050"/>
+        </w:rPr>
+        <w:t>true</w:t>
+      </w:r>
+      <w:proofErr w:type="spellEnd"/>
+      <w:r>
+        <w:rPr>
+          <w:rFonts w:ascii="Consolas" w:hAnsi="Consolas"/>
+          <w:color w:val="00B050"/>
+        </w:rPr>
+        <w:t xml:space="preserve">) on voudra faire </w:t>
+      </w:r>
       <w:proofErr w:type="gramStart"/>
       <w:r>
         <w:rPr>
           <w:rFonts w:ascii="Consolas" w:hAnsi="Consolas"/>
-          <w:b/>
-          <w:bCs/>
           <w:color w:val="00B050"/>
         </w:rPr>
-        <w:t>).State</w:t>
+        <w:t xml:space="preserve">le </w:t>
+      </w:r>
+      <w:r>
+        <w:rPr>
+          <w:rFonts w:ascii="Consolas" w:hAnsi="Consolas"/>
+          <w:color w:val="00B050"/>
+        </w:rPr>
+        <w:t>u</w:t>
+      </w:r>
+      <w:r>
+        <w:rPr>
+          <w:rFonts w:ascii="Consolas" w:hAnsi="Consolas"/>
+          <w:color w:val="00B050"/>
+        </w:rPr>
+        <w:t>pdate</w:t>
       </w:r>
       <w:proofErr w:type="gramEnd"/>
       <w:r>
@@ -4329,41 +4318,65 @@
           <w:rFonts w:ascii="Consolas" w:hAnsi="Consolas"/>
           <w:color w:val="00B050"/>
         </w:rPr>
-        <w:t xml:space="preserve"> permet d’accéder à cet état. </w:t>
-      </w:r>
-      <w:r>
-        <w:rPr>
-          <w:rFonts w:ascii="Consolas" w:hAnsi="Consolas"/>
+        <w:t xml:space="preserve"> pour que l’objet soit </w:t>
+      </w:r>
+      <w:r>
+        <w:rPr>
+          <w:rFonts w:ascii="Consolas" w:hAnsi="Consolas"/>
+          <w:b/>
+          <w:bCs/>
           <w:color w:val="00B050"/>
         </w:rPr>
-        <w:t>Quand</w:t>
+        <w:t xml:space="preserve">"tracker" </w:t>
       </w:r>
       <w:r>
         <w:rPr>
           <w:rFonts w:ascii="Consolas" w:hAnsi="Consolas"/>
           <w:color w:val="00B050"/>
         </w:rPr>
-        <w:t xml:space="preserve"> l’objet</w:t>
+        <w:t>par EF et on mettra à jour la BD.</w:t>
       </w:r>
       <w:r>
         <w:rPr>
           <w:rFonts w:ascii="Consolas" w:hAnsi="Consolas"/>
           <w:color w:val="00B050"/>
         </w:rPr>
-        <w:t xml:space="preserve"> provient d'un formulaire HTML</w:t>
-      </w:r>
-      <w:r>
-        <w:rPr>
-          <w:rFonts w:ascii="Consolas" w:hAnsi="Consolas"/>
+        <w:t xml:space="preserve"> Si l’objet est déjà </w:t>
+      </w:r>
+      <w:r>
+        <w:rPr>
+          <w:rFonts w:ascii="Consolas" w:hAnsi="Consolas"/>
+          <w:b/>
+          <w:bCs/>
           <w:color w:val="00B050"/>
         </w:rPr>
-        <w:t xml:space="preserve"> via une requête POST par exemple</w:t>
+        <w:t>"tracker"</w:t>
       </w:r>
       <w:r>
         <w:rPr>
           <w:rFonts w:ascii="Consolas" w:hAnsi="Consolas"/>
           <w:color w:val="00B050"/>
         </w:rPr>
+        <w:t xml:space="preserve">, on spécifiera que l’état est </w:t>
+      </w:r>
+      <w:proofErr w:type="spellStart"/>
+      <w:r>
+        <w:rPr>
+          <w:rFonts w:ascii="Consolas" w:hAnsi="Consolas"/>
+          <w:b/>
+          <w:bCs/>
+          <w:color w:val="00B050"/>
+        </w:rPr>
+        <w:t>Modified</w:t>
+      </w:r>
+      <w:proofErr w:type="spellEnd"/>
+      <w:r>
+        <w:rPr>
+          <w:rFonts w:ascii="Consolas" w:hAnsi="Consolas"/>
+          <w:b/>
+          <w:bCs/>
+          <w:color w:val="00B050"/>
+        </w:rPr>
         <w:t xml:space="preserve">, </w:t>
       </w:r>
       <w:r>
@@ -4371,329 +4384,32 @@
           <w:rFonts w:ascii="Consolas" w:hAnsi="Consolas"/>
           <w:color w:val="00B050"/>
         </w:rPr>
-        <w:t>il</w:t>
-      </w:r>
+        <w:t xml:space="preserve">pour être certain </w:t>
+      </w:r>
+      <w:proofErr w:type="spellStart"/>
+      <w:proofErr w:type="gramStart"/>
       <w:r>
         <w:rPr>
           <w:rFonts w:ascii="Consolas" w:hAnsi="Consolas"/>
           <w:color w:val="00B050"/>
         </w:rPr>
-        <w:t xml:space="preserve"> N'EST PAS tracké</w:t>
-      </w:r>
+        <w:t>SaveChangesAsync</w:t>
+      </w:r>
+      <w:proofErr w:type="spellEnd"/>
       <w:r>
         <w:rPr>
           <w:rFonts w:ascii="Consolas" w:hAnsi="Consolas"/>
           <w:color w:val="00B050"/>
         </w:rPr>
-        <w:t xml:space="preserve"> par EF.</w:t>
-      </w:r>
+        <w:t>(</w:t>
+      </w:r>
+      <w:proofErr w:type="gramEnd"/>
       <w:r>
         <w:rPr>
           <w:rFonts w:ascii="Consolas" w:hAnsi="Consolas"/>
           <w:color w:val="00B050"/>
         </w:rPr>
-        <w:t xml:space="preserve"> </w:t>
-      </w:r>
-      <w:r>
-        <w:rPr>
-          <w:rFonts w:ascii="Consolas" w:hAnsi="Consolas"/>
-          <w:color w:val="00B050"/>
-        </w:rPr>
-        <w:t>S</w:t>
-      </w:r>
-      <w:r>
-        <w:rPr>
-          <w:rFonts w:ascii="Consolas" w:hAnsi="Consolas"/>
-          <w:color w:val="00B050"/>
-        </w:rPr>
-        <w:t>on</w:t>
-      </w:r>
-      <w:r>
-        <w:rPr>
-          <w:rFonts w:ascii="Consolas" w:hAnsi="Consolas"/>
-          <w:color w:val="00B050"/>
-        </w:rPr>
-        <w:t xml:space="preserve"> </w:t>
-      </w:r>
-      <w:r>
-        <w:rPr>
-          <w:rFonts w:ascii="Consolas" w:hAnsi="Consolas"/>
-          <w:b/>
-          <w:bCs/>
-          <w:color w:val="00B050"/>
-        </w:rPr>
-        <w:t>état</w:t>
-      </w:r>
-      <w:r>
-        <w:rPr>
-          <w:rFonts w:ascii="Consolas" w:hAnsi="Consolas"/>
-          <w:b/>
-          <w:bCs/>
-          <w:color w:val="00B050"/>
-        </w:rPr>
-        <w:t xml:space="preserve"> </w:t>
-      </w:r>
-      <w:r>
-        <w:rPr>
-          <w:rFonts w:ascii="Consolas" w:hAnsi="Consolas"/>
-          <w:b/>
-          <w:bCs/>
-          <w:color w:val="00B050"/>
-        </w:rPr>
-        <w:t>(</w:t>
-      </w:r>
-      <w:r>
-        <w:rPr>
-          <w:rFonts w:ascii="Consolas" w:hAnsi="Consolas"/>
-          <w:b/>
-          <w:bCs/>
-          <w:color w:val="00B050"/>
-        </w:rPr>
-        <w:t>state</w:t>
-      </w:r>
-      <w:r>
-        <w:rPr>
-          <w:rFonts w:ascii="Consolas" w:hAnsi="Consolas"/>
-          <w:b/>
-          <w:bCs/>
-          <w:color w:val="00B050"/>
-        </w:rPr>
-        <w:t>)</w:t>
-      </w:r>
-      <w:r>
-        <w:rPr>
-          <w:rFonts w:ascii="Consolas" w:hAnsi="Consolas"/>
-          <w:b/>
-          <w:bCs/>
-          <w:color w:val="00B050"/>
-        </w:rPr>
-        <w:t xml:space="preserve"> </w:t>
-      </w:r>
-      <w:r>
-        <w:rPr>
-          <w:rFonts w:ascii="Consolas" w:hAnsi="Consolas"/>
-          <w:color w:val="00B050"/>
-        </w:rPr>
-        <w:t>est</w:t>
-      </w:r>
-      <w:r>
-        <w:rPr>
-          <w:rFonts w:ascii="Consolas" w:hAnsi="Consolas"/>
-          <w:color w:val="00B050"/>
-        </w:rPr>
-        <w:t xml:space="preserve"> alors</w:t>
-      </w:r>
-      <w:r>
-        <w:rPr>
-          <w:rFonts w:ascii="Consolas" w:hAnsi="Consolas"/>
-          <w:color w:val="00B050"/>
-        </w:rPr>
-        <w:t xml:space="preserve"> </w:t>
-      </w:r>
-      <w:proofErr w:type="spellStart"/>
-      <w:r>
-        <w:rPr>
-          <w:rFonts w:ascii="Consolas" w:hAnsi="Consolas"/>
-          <w:b/>
-          <w:bCs/>
-          <w:color w:val="00B050"/>
-        </w:rPr>
-        <w:t>Detached</w:t>
-      </w:r>
-      <w:proofErr w:type="spellEnd"/>
-      <w:r>
-        <w:rPr>
-          <w:rFonts w:ascii="Consolas" w:hAnsi="Consolas"/>
-          <w:b/>
-          <w:bCs/>
-          <w:color w:val="00B050"/>
-        </w:rPr>
-        <w:t xml:space="preserve"> (</w:t>
-      </w:r>
-      <w:proofErr w:type="spellStart"/>
-      <w:r>
-        <w:rPr>
-          <w:rFonts w:ascii="Consolas" w:hAnsi="Consolas"/>
-          <w:b/>
-          <w:bCs/>
-          <w:color w:val="00B050"/>
-        </w:rPr>
-        <w:t>EntityState.Detached</w:t>
-      </w:r>
-      <w:proofErr w:type="spellEnd"/>
-      <w:r>
-        <w:rPr>
-          <w:rFonts w:ascii="Consolas" w:hAnsi="Consolas"/>
-          <w:b/>
-          <w:bCs/>
-          <w:color w:val="00B050"/>
-        </w:rPr>
-        <w:t>)</w:t>
-      </w:r>
-      <w:r>
-        <w:rPr>
-          <w:rFonts w:ascii="Consolas" w:hAnsi="Consolas"/>
-          <w:color w:val="00B050"/>
-        </w:rPr>
-        <w:t>.</w:t>
-      </w:r>
-      <w:r>
-        <w:rPr>
-          <w:rFonts w:ascii="Consolas" w:hAnsi="Consolas"/>
-          <w:color w:val="00B050"/>
-        </w:rPr>
-        <w:t xml:space="preserve"> Dans ce cas-ci, (if est </w:t>
-      </w:r>
-      <w:proofErr w:type="spellStart"/>
-      <w:r>
-        <w:rPr>
-          <w:rFonts w:ascii="Consolas" w:hAnsi="Consolas"/>
-          <w:color w:val="00B050"/>
-        </w:rPr>
-        <w:t>true</w:t>
-      </w:r>
-      <w:proofErr w:type="spellEnd"/>
-      <w:r>
-        <w:rPr>
-          <w:rFonts w:ascii="Consolas" w:hAnsi="Consolas"/>
-          <w:color w:val="00B050"/>
-        </w:rPr>
-        <w:t xml:space="preserve">) on voudra faire </w:t>
-      </w:r>
-      <w:proofErr w:type="gramStart"/>
-      <w:r>
-        <w:rPr>
-          <w:rFonts w:ascii="Consolas" w:hAnsi="Consolas"/>
-          <w:color w:val="00B050"/>
-        </w:rPr>
-        <w:t xml:space="preserve">le </w:t>
-      </w:r>
-      <w:r>
-        <w:rPr>
-          <w:rFonts w:ascii="Consolas" w:hAnsi="Consolas"/>
-          <w:color w:val="00B050"/>
-        </w:rPr>
-        <w:t>u</w:t>
-      </w:r>
-      <w:r>
-        <w:rPr>
-          <w:rFonts w:ascii="Consolas" w:hAnsi="Consolas"/>
-          <w:color w:val="00B050"/>
-        </w:rPr>
-        <w:t>pdate</w:t>
-      </w:r>
-      <w:proofErr w:type="gramEnd"/>
-      <w:r>
-        <w:rPr>
-          <w:rFonts w:ascii="Consolas" w:hAnsi="Consolas"/>
-          <w:color w:val="00B050"/>
-        </w:rPr>
-        <w:t xml:space="preserve"> pour que l’objet soit </w:t>
-      </w:r>
-      <w:r>
-        <w:rPr>
-          <w:rFonts w:ascii="Consolas" w:hAnsi="Consolas"/>
-          <w:b/>
-          <w:bCs/>
-          <w:color w:val="00B050"/>
-        </w:rPr>
-        <w:t xml:space="preserve">"tracker" </w:t>
-      </w:r>
-      <w:r>
-        <w:rPr>
-          <w:rFonts w:ascii="Consolas" w:hAnsi="Consolas"/>
-          <w:color w:val="00B050"/>
-        </w:rPr>
-        <w:t>par EF et on mettra à jour la BD.</w:t>
-      </w:r>
-      <w:r>
-        <w:rPr>
-          <w:rFonts w:ascii="Consolas" w:hAnsi="Consolas"/>
-          <w:color w:val="00B050"/>
-        </w:rPr>
-        <w:t xml:space="preserve"> Si l’objet est déjà </w:t>
-      </w:r>
-      <w:r>
-        <w:rPr>
-          <w:rFonts w:ascii="Consolas" w:hAnsi="Consolas"/>
-          <w:b/>
-          <w:bCs/>
-          <w:color w:val="00B050"/>
-        </w:rPr>
-        <w:t>"tracker"</w:t>
-      </w:r>
-      <w:r>
-        <w:rPr>
-          <w:rFonts w:ascii="Consolas" w:hAnsi="Consolas"/>
-          <w:color w:val="00B050"/>
-        </w:rPr>
-        <w:t xml:space="preserve">, on spécifiera que l’état est </w:t>
-      </w:r>
-      <w:proofErr w:type="spellStart"/>
-      <w:r>
-        <w:rPr>
-          <w:rFonts w:ascii="Consolas" w:hAnsi="Consolas"/>
-          <w:b/>
-          <w:bCs/>
-          <w:color w:val="00B050"/>
-        </w:rPr>
-        <w:t>Modified</w:t>
-      </w:r>
-      <w:proofErr w:type="spellEnd"/>
-      <w:r>
-        <w:rPr>
-          <w:rFonts w:ascii="Consolas" w:hAnsi="Consolas"/>
-          <w:b/>
-          <w:bCs/>
-          <w:color w:val="00B050"/>
-        </w:rPr>
-        <w:t xml:space="preserve">, </w:t>
-      </w:r>
-      <w:r>
-        <w:rPr>
-          <w:rFonts w:ascii="Consolas" w:hAnsi="Consolas"/>
-          <w:color w:val="00B050"/>
-        </w:rPr>
-        <w:t xml:space="preserve">pour être certain </w:t>
-      </w:r>
-      <w:proofErr w:type="spellStart"/>
-      <w:proofErr w:type="gramStart"/>
-      <w:r>
-        <w:rPr>
-          <w:rFonts w:ascii="Consolas" w:hAnsi="Consolas"/>
-          <w:color w:val="00B050"/>
-        </w:rPr>
-        <w:t>SaveChangesAsync</w:t>
-      </w:r>
-      <w:proofErr w:type="spellEnd"/>
-      <w:r>
-        <w:rPr>
-          <w:rFonts w:ascii="Consolas" w:hAnsi="Consolas"/>
-          <w:color w:val="00B050"/>
-        </w:rPr>
-        <w:t>(</w:t>
-      </w:r>
-      <w:proofErr w:type="gramEnd"/>
-      <w:r>
-        <w:rPr>
-          <w:rFonts w:ascii="Consolas" w:hAnsi="Consolas"/>
-          <w:color w:val="00B050"/>
-        </w:rPr>
-        <w:t xml:space="preserve">) </w:t>
-      </w:r>
-      <w:r>
-        <w:rPr>
-          <w:rFonts w:ascii="Consolas" w:hAnsi="Consolas"/>
-          <w:color w:val="00B050"/>
-        </w:rPr>
-        <w:t>fasse</w:t>
-      </w:r>
-      <w:r>
-        <w:rPr>
-          <w:rFonts w:ascii="Consolas" w:hAnsi="Consolas"/>
-          <w:color w:val="00B050"/>
-        </w:rPr>
-        <w:t xml:space="preserve"> bien </w:t>
+        <w:t xml:space="preserve">) fasse bien </w:t>
       </w:r>
       <w:proofErr w:type="gramStart"/>
       <w:r>
@@ -4941,7 +4657,6 @@
         <w:rPr>
           <w:rFonts w:ascii="Consolas" w:hAnsi="Consolas"/>
           <w:highlight w:val="cyan"/>
-          <w:lang w:val="en-US"/>
         </w:rPr>
       </w:pPr>
       <w:r>
@@ -4955,7 +4670,6 @@
         <w:rPr>
           <w:rFonts w:ascii="Consolas" w:hAnsi="Consolas"/>
           <w:highlight w:val="cyan"/>
-          <w:lang w:val="en-US"/>
         </w:rPr>
         <w:t>}</w:t>
       </w:r>
@@ -4978,31 +4692,31 @@
         <w:rPr>
           <w:rFonts w:ascii="Consolas" w:hAnsi="Consolas"/>
           <w:highlight w:val="cyan"/>
-          <w:lang w:val="en-CA"/>
         </w:rPr>
       </w:pPr>
       <w:r>
         <w:rPr>
           <w:rFonts w:ascii="Consolas" w:hAnsi="Consolas"/>
           <w:highlight w:val="cyan"/>
-          <w:lang w:val="en-US"/>
         </w:rPr>
         <w:t xml:space="preserve">    </w:t>
       </w:r>
+      <w:proofErr w:type="spellStart"/>
+      <w:proofErr w:type="gramStart"/>
       <w:r>
         <w:rPr>
           <w:rFonts w:ascii="Consolas" w:hAnsi="Consolas"/>
           <w:color w:val="0000FF"/>
           <w:highlight w:val="cyan"/>
-          <w:lang w:val="en-CA"/>
         </w:rPr>
         <w:t>else</w:t>
       </w:r>
+      <w:proofErr w:type="spellEnd"/>
+      <w:proofErr w:type="gramEnd"/>
       <w:r>
         <w:rPr>
           <w:rFonts w:ascii="Consolas" w:hAnsi="Consolas"/>
           <w:highlight w:val="cyan"/>
-          <w:lang w:val="en-CA"/>
         </w:rPr>
         <w:t xml:space="preserve"> </w:t>
       </w:r>
@@ -5025,14 +4739,12 @@
         <w:rPr>
           <w:rFonts w:ascii="Consolas" w:hAnsi="Consolas"/>
           <w:highlight w:val="cyan"/>
-          <w:lang w:val="en-CA"/>
         </w:rPr>
       </w:pPr>
       <w:r>
         <w:rPr>
           <w:rFonts w:ascii="Consolas" w:hAnsi="Consolas"/>
           <w:highlight w:val="cyan"/>
-          <w:lang w:val="en-CA"/>
         </w:rPr>
         <w:t xml:space="preserve">    {</w:t>
       </w:r>
@@ -5063,7 +4775,6 @@
         <w:rPr>
           <w:rFonts w:ascii="Consolas" w:hAnsi="Consolas"/>
           <w:highlight w:val="cyan"/>
-          <w:lang w:val="en-CA"/>
         </w:rPr>
         <w:t xml:space="preserve"> </w:t>
       </w:r>
@@ -5369,7 +5080,7 @@
         <w:pBdr>
           <w:top w:val="single" w:sz="4" w:space="1" w:color="auto"/>
           <w:left w:val="single" w:sz="4" w:space="4" w:color="auto"/>
-          <w:bottom w:val="single" w:sz="4" w:space="1" w:color="auto"/>
+          <w:bottom w:val="single" w:sz="4" w:space="0" w:color="auto"/>
           <w:right w:val="single" w:sz="4" w:space="4" w:color="auto"/>
         </w:pBdr>
         <w:shd w:val="clear" w:color="auto" w:fill="FFF2CC" w:themeFill="accent4" w:themeFillTint="33"/>
@@ -5450,6 +5161,238 @@
           <w:lang w:val="en-CA"/>
         </w:rPr>
         <w:t>)</w:t>
+      </w:r>
+    </w:p>
+    <w:p>
+      <w:pPr>
+        <w:pStyle w:val="EtapesInstructions"/>
+        <w:numPr>
+          <w:ilvl w:val="0"/>
+          <w:numId w:val="0"/>
+        </w:numPr>
+        <w:pBdr>
+          <w:top w:val="single" w:sz="4" w:space="1" w:color="auto"/>
+          <w:left w:val="single" w:sz="4" w:space="4" w:color="auto"/>
+          <w:bottom w:val="single" w:sz="4" w:space="0" w:color="auto"/>
+          <w:right w:val="single" w:sz="4" w:space="4" w:color="auto"/>
+        </w:pBdr>
+        <w:shd w:val="clear" w:color="auto" w:fill="FFF2CC" w:themeFill="accent4" w:themeFillTint="33"/>
+        <w:spacing w:before="0" w:after="0"/>
+        <w:rPr>
+          <w:rFonts w:ascii="Consolas" w:hAnsi="Consolas"/>
+        </w:rPr>
+      </w:pPr>
+      <w:r>
+        <w:rPr>
+          <w:rFonts w:ascii="Consolas" w:hAnsi="Consolas"/>
+        </w:rPr>
+        <w:t>{</w:t>
+      </w:r>
+    </w:p>
+    <w:p>
+      <w:pPr>
+        <w:pStyle w:val="EtapesInstructions"/>
+        <w:numPr>
+          <w:ilvl w:val="0"/>
+          <w:numId w:val="0"/>
+        </w:numPr>
+        <w:pBdr>
+          <w:top w:val="single" w:sz="4" w:space="1" w:color="auto"/>
+          <w:left w:val="single" w:sz="4" w:space="4" w:color="auto"/>
+          <w:bottom w:val="single" w:sz="4" w:space="0" w:color="auto"/>
+          <w:right w:val="single" w:sz="4" w:space="4" w:color="auto"/>
+        </w:pBdr>
+        <w:shd w:val="clear" w:color="auto" w:fill="FFF2CC" w:themeFill="accent4" w:themeFillTint="33"/>
+        <w:spacing w:before="0" w:after="0"/>
+        <w:rPr>
+          <w:rFonts w:ascii="Consolas" w:hAnsi="Consolas"/>
+          <w:lang w:val="en-CA"/>
+        </w:rPr>
+      </w:pPr>
+      <w:r>
+        <w:rPr>
+          <w:rFonts w:ascii="Consolas" w:hAnsi="Consolas"/>
+          <w:color w:val="00B050"/>
+        </w:rPr>
+        <w:t xml:space="preserve">/* Retourne une liste d’entités du type correspondant. </w:t>
+      </w:r>
+      <w:r>
+        <w:rPr>
+          <w:rFonts w:ascii="Consolas" w:hAnsi="Consolas"/>
+          <w:color w:val="00B050"/>
+          <w:lang w:val="en-CA"/>
+        </w:rPr>
+        <w:t>*/</w:t>
+      </w:r>
+    </w:p>
+    <w:p>
+      <w:pPr>
+        <w:pStyle w:val="EtapesInstructions"/>
+        <w:numPr>
+          <w:ilvl w:val="0"/>
+          <w:numId w:val="0"/>
+        </w:numPr>
+        <w:pBdr>
+          <w:top w:val="single" w:sz="4" w:space="1" w:color="auto"/>
+          <w:left w:val="single" w:sz="4" w:space="4" w:color="auto"/>
+          <w:bottom w:val="single" w:sz="4" w:space="0" w:color="auto"/>
+          <w:right w:val="single" w:sz="4" w:space="4" w:color="auto"/>
+        </w:pBdr>
+        <w:shd w:val="clear" w:color="auto" w:fill="FFF2CC" w:themeFill="accent4" w:themeFillTint="33"/>
+        <w:spacing w:before="0" w:after="0"/>
+        <w:rPr>
+          <w:rFonts w:ascii="Consolas" w:hAnsi="Consolas"/>
+          <w:lang w:val="en-CA"/>
+        </w:rPr>
+      </w:pPr>
+      <w:r>
+        <w:rPr>
+          <w:rFonts w:ascii="Consolas" w:hAnsi="Consolas"/>
+          <w:lang w:val="en-CA"/>
+        </w:rPr>
+        <w:t xml:space="preserve">    </w:t>
+      </w:r>
+      <w:r>
+        <w:rPr>
+          <w:rFonts w:ascii="Consolas" w:hAnsi="Consolas" w:cs="Cascadia Mono"/>
+          <w:color w:val="0000FF"/>
+          <w:highlight w:val="cyan"/>
+          <w:lang w:val="en-CA"/>
+        </w:rPr>
+        <w:t>return</w:t>
+      </w:r>
+      <w:r>
+        <w:rPr>
+          <w:rFonts w:ascii="Consolas" w:hAnsi="Consolas" w:cs="Cascadia Mono"/>
+          <w:color w:val="000000"/>
+          <w:highlight w:val="cyan"/>
+          <w:lang w:val="en-CA"/>
+        </w:rPr>
+        <w:t xml:space="preserve"> </w:t>
+      </w:r>
+      <w:r>
+        <w:rPr>
+          <w:rFonts w:ascii="Consolas" w:hAnsi="Consolas" w:cs="Cascadia Mono"/>
+          <w:color w:val="0000FF"/>
+          <w:highlight w:val="cyan"/>
+          <w:lang w:val="en-CA"/>
+        </w:rPr>
+        <w:t>await</w:t>
+      </w:r>
+      <w:r>
+        <w:rPr>
+          <w:rFonts w:ascii="Consolas" w:hAnsi="Consolas" w:cs="Cascadia Mono"/>
+          <w:color w:val="000000"/>
+          <w:highlight w:val="cyan"/>
+          <w:lang w:val="en-CA"/>
+        </w:rPr>
+        <w:t xml:space="preserve"> _</w:t>
+      </w:r>
+      <w:proofErr w:type="spellStart"/>
+      <w:r>
+        <w:rPr>
+          <w:rFonts w:ascii="Consolas" w:hAnsi="Consolas" w:cs="Cascadia Mono"/>
+          <w:color w:val="000000"/>
+          <w:highlight w:val="cyan"/>
+          <w:lang w:val="en-CA"/>
+        </w:rPr>
+        <w:t>dbContext.Set</w:t>
+      </w:r>
+      <w:proofErr w:type="spellEnd"/>
+      <w:r>
+        <w:rPr>
+          <w:rFonts w:ascii="Consolas" w:hAnsi="Consolas" w:cs="Cascadia Mono"/>
+          <w:color w:val="000000"/>
+          <w:highlight w:val="cyan"/>
+          <w:lang w:val="en-CA"/>
+        </w:rPr>
+        <w:t>&lt;T&gt;(</w:t>
+      </w:r>
+      <w:proofErr w:type="gramStart"/>
+      <w:r>
+        <w:rPr>
+          <w:rFonts w:ascii="Consolas" w:hAnsi="Consolas" w:cs="Cascadia Mono"/>
+          <w:color w:val="000000"/>
+          <w:highlight w:val="cyan"/>
+          <w:lang w:val="en-CA"/>
+        </w:rPr>
+        <w:t>).</w:t>
+      </w:r>
+      <w:proofErr w:type="spellStart"/>
+      <w:r>
+        <w:rPr>
+          <w:rFonts w:ascii="Consolas" w:hAnsi="Consolas" w:cs="Cascadia Mono"/>
+          <w:color w:val="000000"/>
+          <w:highlight w:val="cyan"/>
+          <w:lang w:val="en-CA"/>
+        </w:rPr>
+        <w:t>ToListAsync</w:t>
+      </w:r>
+      <w:proofErr w:type="spellEnd"/>
+      <w:proofErr w:type="gramEnd"/>
+      <w:r>
+        <w:rPr>
+          <w:rFonts w:ascii="Consolas" w:hAnsi="Consolas" w:cs="Cascadia Mono"/>
+          <w:color w:val="000000"/>
+          <w:highlight w:val="cyan"/>
+          <w:lang w:val="en-CA"/>
+        </w:rPr>
+        <w:t>();</w:t>
+      </w:r>
+    </w:p>
+    <w:p>
+      <w:pPr>
+        <w:pStyle w:val="EtapesInstructions"/>
+        <w:numPr>
+          <w:ilvl w:val="0"/>
+          <w:numId w:val="0"/>
+        </w:numPr>
+        <w:pBdr>
+          <w:top w:val="single" w:sz="4" w:space="1" w:color="auto"/>
+          <w:left w:val="single" w:sz="4" w:space="4" w:color="auto"/>
+          <w:bottom w:val="single" w:sz="4" w:space="0" w:color="auto"/>
+          <w:right w:val="single" w:sz="4" w:space="4" w:color="auto"/>
+        </w:pBdr>
+        <w:shd w:val="clear" w:color="auto" w:fill="FFF2CC" w:themeFill="accent4" w:themeFillTint="33"/>
+        <w:spacing w:before="0" w:after="0"/>
+        <w:rPr>
+          <w:rFonts w:ascii="Consolas" w:hAnsi="Consolas"/>
+          <w:lang w:val="en-CA"/>
+        </w:rPr>
+      </w:pPr>
+      <w:r>
+        <w:rPr>
+          <w:rFonts w:ascii="Consolas" w:hAnsi="Consolas"/>
+          <w:lang w:val="en-CA"/>
+        </w:rPr>
+        <w:t>}</w:t>
+      </w:r>
+    </w:p>
+    <w:p>
+      <w:pPr>
+        <w:pStyle w:val="EtapesInstructions"/>
+        <w:numPr>
+          <w:ilvl w:val="0"/>
+          <w:numId w:val="0"/>
+        </w:numPr>
+        <w:spacing w:before="0" w:after="0"/>
+        <w:rPr>
+          <w:lang w:val="en-CA"/>
+        </w:rPr>
+      </w:pPr>
+    </w:p>
+    <w:p>
+      <w:pPr>
+        <w:pStyle w:val="Titre3"/>
+        <w:rPr>
+          <w:lang w:val="en-CA"/>
+        </w:rPr>
+      </w:pPr>
+      <w:r>
+        <w:rPr>
+          <w:lang w:val="en-CA"/>
+        </w:rPr>
+        <w:t>Getbyid</w:t>
       </w:r>
     </w:p>
     <w:p>
@@ -5475,9 +5418,89 @@
       <w:r>
         <w:rPr>
           <w:rFonts w:ascii="Consolas" w:hAnsi="Consolas"/>
-          <w:lang w:val="en-CA"/>
-        </w:rPr>
-        <w:t>{</w:t>
+          <w:color w:val="0000FF"/>
+          <w:lang w:val="en-CA"/>
+        </w:rPr>
+        <w:t>public</w:t>
+      </w:r>
+      <w:r>
+        <w:rPr>
+          <w:rFonts w:ascii="Consolas" w:hAnsi="Consolas"/>
+          <w:lang w:val="en-CA"/>
+        </w:rPr>
+        <w:t xml:space="preserve"> </w:t>
+      </w:r>
+      <w:r>
+        <w:rPr>
+          <w:rFonts w:ascii="Consolas" w:hAnsi="Consolas"/>
+          <w:color w:val="0000FF"/>
+          <w:highlight w:val="green"/>
+          <w:lang w:val="en-CA"/>
+        </w:rPr>
+        <w:t>async</w:t>
+      </w:r>
+      <w:r>
+        <w:rPr>
+          <w:rFonts w:ascii="Consolas" w:hAnsi="Consolas"/>
+          <w:lang w:val="en-CA"/>
+        </w:rPr>
+        <w:t xml:space="preserve"> Task&lt;</w:t>
+      </w:r>
+      <w:r>
+        <w:rPr>
+          <w:rFonts w:ascii="Consolas" w:hAnsi="Consolas"/>
+          <w:color w:val="FF0000"/>
+          <w:lang w:val="en-CA"/>
+        </w:rPr>
+        <w:t>T</w:t>
+      </w:r>
+      <w:r>
+        <w:rPr>
+          <w:rFonts w:ascii="Consolas" w:hAnsi="Consolas"/>
+          <w:color w:val="FF0000"/>
+          <w:lang w:val="en-CA"/>
+        </w:rPr>
+        <w:t>?</w:t>
+      </w:r>
+      <w:r>
+        <w:rPr>
+          <w:rFonts w:ascii="Consolas" w:hAnsi="Consolas"/>
+          <w:lang w:val="en-CA"/>
+        </w:rPr>
+        <w:t xml:space="preserve">&gt; </w:t>
+      </w:r>
+      <w:proofErr w:type="spellStart"/>
+      <w:proofErr w:type="gramStart"/>
+      <w:r>
+        <w:rPr>
+          <w:rFonts w:ascii="Consolas" w:hAnsi="Consolas"/>
+          <w:lang w:val="en-CA"/>
+        </w:rPr>
+        <w:t>GetByIdAsync</w:t>
+      </w:r>
+      <w:proofErr w:type="spellEnd"/>
+      <w:r>
+        <w:rPr>
+          <w:rFonts w:ascii="Consolas" w:hAnsi="Consolas"/>
+          <w:lang w:val="en-CA"/>
+        </w:rPr>
+        <w:t>(</w:t>
+      </w:r>
+      <w:proofErr w:type="gramEnd"/>
+      <w:r>
+        <w:rPr>
+          <w:rFonts w:ascii="Consolas" w:hAnsi="Consolas"/>
+          <w:color w:val="0000FF"/>
+          <w:lang w:val="en-CA"/>
+        </w:rPr>
+        <w:t>int</w:t>
+      </w:r>
+      <w:r>
+        <w:rPr>
+          <w:rFonts w:ascii="Consolas" w:hAnsi="Consolas"/>
+          <w:lang w:val="en-CA"/>
+        </w:rPr>
+        <w:t xml:space="preserve"> id)</w:t>
       </w:r>
     </w:p>
     <w:p>
@@ -5502,334 +5525,6 @@
       <w:r>
         <w:rPr>
           <w:rFonts w:ascii="Consolas" w:hAnsi="Consolas"/>
-          <w:color w:val="00B050"/>
-        </w:rPr>
-        <w:t>/* Retourne une liste d’</w:t>
-      </w:r>
-      <w:r>
-        <w:rPr>
-          <w:rFonts w:ascii="Consolas" w:hAnsi="Consolas"/>
-          <w:color w:val="00B050"/>
-        </w:rPr>
-        <w:t>entité</w:t>
-      </w:r>
-      <w:r>
-        <w:rPr>
-          <w:rFonts w:ascii="Consolas" w:hAnsi="Consolas"/>
-          <w:color w:val="00B050"/>
-        </w:rPr>
-        <w:t>s</w:t>
-      </w:r>
-      <w:r>
-        <w:rPr>
-          <w:rFonts w:ascii="Consolas" w:hAnsi="Consolas"/>
-          <w:color w:val="00B050"/>
-        </w:rPr>
-        <w:t xml:space="preserve"> du type correspondan</w:t>
-      </w:r>
-      <w:r>
-        <w:rPr>
-          <w:rFonts w:ascii="Consolas" w:hAnsi="Consolas"/>
-          <w:color w:val="00B050"/>
-        </w:rPr>
-        <w:t>t. */</w:t>
-      </w:r>
-    </w:p>
-    <w:p>
-      <w:pPr>
-        <w:pStyle w:val="EtapesInstructions"/>
-        <w:numPr>
-          <w:ilvl w:val="0"/>
-          <w:numId w:val="0"/>
-        </w:numPr>
-        <w:pBdr>
-          <w:top w:val="single" w:sz="4" w:space="1" w:color="auto"/>
-          <w:left w:val="single" w:sz="4" w:space="4" w:color="auto"/>
-          <w:bottom w:val="single" w:sz="4" w:space="1" w:color="auto"/>
-          <w:right w:val="single" w:sz="4" w:space="4" w:color="auto"/>
-        </w:pBdr>
-        <w:shd w:val="clear" w:color="auto" w:fill="FFF2CC" w:themeFill="accent4" w:themeFillTint="33"/>
-        <w:spacing w:before="0" w:after="0"/>
-        <w:rPr>
-          <w:rFonts w:ascii="Consolas" w:hAnsi="Consolas"/>
-        </w:rPr>
-      </w:pPr>
-      <w:r>
-        <w:rPr>
-          <w:rFonts w:ascii="Consolas" w:hAnsi="Consolas"/>
-        </w:rPr>
-        <w:t xml:space="preserve">    </w:t>
-      </w:r>
-      <w:proofErr w:type="gramStart"/>
-      <w:r>
-        <w:rPr>
-          <w:rFonts w:ascii="Consolas" w:hAnsi="Consolas" w:cs="Cascadia Mono"/>
-          <w:color w:val="0000FF"/>
-          <w:highlight w:val="cyan"/>
-        </w:rPr>
-        <w:t>return</w:t>
-      </w:r>
-      <w:proofErr w:type="gramEnd"/>
-      <w:r>
-        <w:rPr>
-          <w:rFonts w:ascii="Consolas" w:hAnsi="Consolas" w:cs="Cascadia Mono"/>
-          <w:color w:val="000000"/>
-          <w:highlight w:val="cyan"/>
-        </w:rPr>
-        <w:t xml:space="preserve"> </w:t>
-      </w:r>
-      <w:proofErr w:type="spellStart"/>
-      <w:r>
-        <w:rPr>
-          <w:rFonts w:ascii="Consolas" w:hAnsi="Consolas" w:cs="Cascadia Mono"/>
-          <w:color w:val="0000FF"/>
-          <w:highlight w:val="cyan"/>
-        </w:rPr>
-        <w:t>await</w:t>
-      </w:r>
-      <w:proofErr w:type="spellEnd"/>
-      <w:r>
-        <w:rPr>
-          <w:rFonts w:ascii="Consolas" w:hAnsi="Consolas" w:cs="Cascadia Mono"/>
-          <w:color w:val="000000"/>
-          <w:highlight w:val="cyan"/>
-        </w:rPr>
-        <w:t xml:space="preserve"> _</w:t>
-      </w:r>
-      <w:proofErr w:type="spellStart"/>
-      <w:r>
-        <w:rPr>
-          <w:rFonts w:ascii="Consolas" w:hAnsi="Consolas" w:cs="Cascadia Mono"/>
-          <w:color w:val="000000"/>
-          <w:highlight w:val="cyan"/>
-        </w:rPr>
-        <w:t>dbContext.Set</w:t>
-      </w:r>
-      <w:proofErr w:type="spellEnd"/>
-      <w:r>
-        <w:rPr>
-          <w:rFonts w:ascii="Consolas" w:hAnsi="Consolas" w:cs="Cascadia Mono"/>
-          <w:color w:val="000000"/>
-          <w:highlight w:val="cyan"/>
-        </w:rPr>
-        <w:t>&lt;T&gt;(</w:t>
-      </w:r>
-      <w:proofErr w:type="gramStart"/>
-      <w:r>
-        <w:rPr>
-          <w:rFonts w:ascii="Consolas" w:hAnsi="Consolas" w:cs="Cascadia Mono"/>
-          <w:color w:val="000000"/>
-          <w:highlight w:val="cyan"/>
-        </w:rPr>
-        <w:t>).</w:t>
-      </w:r>
-      <w:proofErr w:type="spellStart"/>
-      <w:r>
-        <w:rPr>
-          <w:rFonts w:ascii="Consolas" w:hAnsi="Consolas" w:cs="Cascadia Mono"/>
-          <w:color w:val="000000"/>
-          <w:highlight w:val="cyan"/>
-        </w:rPr>
-        <w:t>ToListAsync</w:t>
-      </w:r>
-      <w:proofErr w:type="spellEnd"/>
-      <w:proofErr w:type="gramEnd"/>
-      <w:r>
-        <w:rPr>
-          <w:rFonts w:ascii="Consolas" w:hAnsi="Consolas" w:cs="Cascadia Mono"/>
-          <w:color w:val="000000"/>
-          <w:highlight w:val="cyan"/>
-        </w:rPr>
-        <w:t>();</w:t>
-      </w:r>
-    </w:p>
-    <w:p>
-      <w:pPr>
-        <w:pStyle w:val="EtapesInstructions"/>
-        <w:numPr>
-          <w:ilvl w:val="0"/>
-          <w:numId w:val="0"/>
-        </w:numPr>
-        <w:pBdr>
-          <w:top w:val="single" w:sz="4" w:space="1" w:color="auto"/>
-          <w:left w:val="single" w:sz="4" w:space="4" w:color="auto"/>
-          <w:bottom w:val="single" w:sz="4" w:space="1" w:color="auto"/>
-          <w:right w:val="single" w:sz="4" w:space="4" w:color="auto"/>
-        </w:pBdr>
-        <w:shd w:val="clear" w:color="auto" w:fill="FFF2CC" w:themeFill="accent4" w:themeFillTint="33"/>
-        <w:spacing w:before="0" w:after="0"/>
-        <w:rPr>
-          <w:rFonts w:ascii="Consolas" w:hAnsi="Consolas"/>
-          <w:lang w:val="en-CA"/>
-        </w:rPr>
-      </w:pPr>
-      <w:r>
-        <w:rPr>
-          <w:rFonts w:ascii="Consolas" w:hAnsi="Consolas"/>
-          <w:lang w:val="en-CA"/>
-        </w:rPr>
-        <w:t>}</w:t>
-      </w:r>
-    </w:p>
-    <w:p>
-      <w:pPr>
-        <w:pStyle w:val="EtapesInstructions"/>
-        <w:numPr>
-          <w:ilvl w:val="0"/>
-          <w:numId w:val="0"/>
-        </w:numPr>
-        <w:spacing w:before="0" w:after="0"/>
-        <w:rPr>
-          <w:lang w:val="en-CA"/>
-        </w:rPr>
-      </w:pPr>
-    </w:p>
-    <w:p>
-      <w:pPr>
-        <w:pStyle w:val="Titre3"/>
-        <w:rPr>
-          <w:lang w:val="en-CA"/>
-        </w:rPr>
-      </w:pPr>
-      <w:r>
-        <w:rPr>
-          <w:lang w:val="en-CA"/>
-        </w:rPr>
-        <w:t>Getbyid</w:t>
-      </w:r>
-    </w:p>
-    <w:p>
-      <w:pPr>
-        <w:pStyle w:val="EtapesInstructions"/>
-        <w:numPr>
-          <w:ilvl w:val="0"/>
-          <w:numId w:val="0"/>
-        </w:numPr>
-        <w:pBdr>
-          <w:top w:val="single" w:sz="4" w:space="1" w:color="auto"/>
-          <w:left w:val="single" w:sz="4" w:space="4" w:color="auto"/>
-          <w:bottom w:val="single" w:sz="4" w:space="1" w:color="auto"/>
-          <w:right w:val="single" w:sz="4" w:space="4" w:color="auto"/>
-        </w:pBdr>
-        <w:shd w:val="clear" w:color="auto" w:fill="FFF2CC" w:themeFill="accent4" w:themeFillTint="33"/>
-        <w:spacing w:before="0" w:after="0"/>
-        <w:rPr>
-          <w:rFonts w:ascii="Consolas" w:hAnsi="Consolas"/>
-          <w:lang w:val="en-CA"/>
-        </w:rPr>
-      </w:pPr>
-      <w:r>
-        <w:rPr>
-          <w:rFonts w:ascii="Consolas" w:hAnsi="Consolas"/>
-          <w:color w:val="0000FF"/>
-          <w:lang w:val="en-CA"/>
-        </w:rPr>
-        <w:t>public</w:t>
-      </w:r>
-      <w:r>
-        <w:rPr>
-          <w:rFonts w:ascii="Consolas" w:hAnsi="Consolas"/>
-          <w:lang w:val="en-CA"/>
-        </w:rPr>
-        <w:t xml:space="preserve"> </w:t>
-      </w:r>
-      <w:r>
-        <w:rPr>
-          <w:rFonts w:ascii="Consolas" w:hAnsi="Consolas"/>
-          <w:color w:val="0000FF"/>
-          <w:highlight w:val="green"/>
-          <w:lang w:val="en-CA"/>
-        </w:rPr>
-        <w:t>async</w:t>
-      </w:r>
-      <w:r>
-        <w:rPr>
-          <w:rFonts w:ascii="Consolas" w:hAnsi="Consolas"/>
-          <w:lang w:val="en-CA"/>
-        </w:rPr>
-        <w:t xml:space="preserve"> Task&lt;</w:t>
-      </w:r>
-      <w:r>
-        <w:rPr>
-          <w:rFonts w:ascii="Consolas" w:hAnsi="Consolas"/>
-          <w:color w:val="FF0000"/>
-          <w:lang w:val="en-CA"/>
-        </w:rPr>
-        <w:t>T</w:t>
-      </w:r>
-      <w:r>
-        <w:rPr>
-          <w:rFonts w:ascii="Consolas" w:hAnsi="Consolas"/>
-          <w:color w:val="FF0000"/>
-          <w:lang w:val="en-CA"/>
-        </w:rPr>
-        <w:t>?</w:t>
-      </w:r>
-      <w:r>
-        <w:rPr>
-          <w:rFonts w:ascii="Consolas" w:hAnsi="Consolas"/>
-          <w:lang w:val="en-CA"/>
-        </w:rPr>
-        <w:t xml:space="preserve">&gt; </w:t>
-      </w:r>
-      <w:proofErr w:type="spellStart"/>
-      <w:proofErr w:type="gramStart"/>
-      <w:r>
-        <w:rPr>
-          <w:rFonts w:ascii="Consolas" w:hAnsi="Consolas"/>
-          <w:lang w:val="en-CA"/>
-        </w:rPr>
-        <w:t>GetByIdAsync</w:t>
-      </w:r>
-      <w:proofErr w:type="spellEnd"/>
-      <w:r>
-        <w:rPr>
-          <w:rFonts w:ascii="Consolas" w:hAnsi="Consolas"/>
-          <w:lang w:val="en-CA"/>
-        </w:rPr>
-        <w:t>(</w:t>
-      </w:r>
-      <w:proofErr w:type="gramEnd"/>
-      <w:r>
-        <w:rPr>
-          <w:rFonts w:ascii="Consolas" w:hAnsi="Consolas"/>
-          <w:color w:val="0000FF"/>
-          <w:lang w:val="en-CA"/>
-        </w:rPr>
-        <w:t>int</w:t>
-      </w:r>
-      <w:r>
-        <w:rPr>
-          <w:rFonts w:ascii="Consolas" w:hAnsi="Consolas"/>
-          <w:lang w:val="en-CA"/>
-        </w:rPr>
-        <w:t xml:space="preserve"> id)</w:t>
-      </w:r>
-    </w:p>
-    <w:p>
-      <w:pPr>
-        <w:pStyle w:val="EtapesInstructions"/>
-        <w:numPr>
-          <w:ilvl w:val="0"/>
-          <w:numId w:val="0"/>
-        </w:numPr>
-        <w:pBdr>
-          <w:top w:val="single" w:sz="4" w:space="1" w:color="auto"/>
-          <w:left w:val="single" w:sz="4" w:space="4" w:color="auto"/>
-          <w:bottom w:val="single" w:sz="4" w:space="1" w:color="auto"/>
-          <w:right w:val="single" w:sz="4" w:space="4" w:color="auto"/>
-        </w:pBdr>
-        <w:shd w:val="clear" w:color="auto" w:fill="FFF2CC" w:themeFill="accent4" w:themeFillTint="33"/>
-        <w:spacing w:before="0" w:after="0"/>
-        <w:rPr>
-          <w:rFonts w:ascii="Consolas" w:hAnsi="Consolas"/>
-          <w:lang w:val="en-CA"/>
-        </w:rPr>
-      </w:pPr>
-      <w:r>
-        <w:rPr>
-          <w:rFonts w:ascii="Consolas" w:hAnsi="Consolas"/>
-          <w:lang w:val="en-CA"/>
         </w:rPr>
         <w:t>{</w:t>
       </w:r>
@@ -5874,35 +5569,21 @@
           <w:rFonts w:ascii="Consolas" w:hAnsi="Consolas"/>
           <w:color w:val="00B050"/>
         </w:rPr>
-        <w:t xml:space="preserve">Cherche l’entité du type correspondant. </w:t>
+        <w:t xml:space="preserve">Cherche l’entité du type correspondant. Le type de retour </w:t>
+      </w:r>
+      <w:r>
+        <w:rPr>
+          <w:rFonts w:ascii="Consolas" w:hAnsi="Consolas"/>
+          <w:color w:val="FF0000"/>
+        </w:rPr>
+        <w:t>T?</w:t>
       </w:r>
       <w:r>
         <w:rPr>
           <w:rFonts w:ascii="Consolas" w:hAnsi="Consolas"/>
           <w:color w:val="00B050"/>
         </w:rPr>
-        <w:t xml:space="preserve">Le type de retour </w:t>
-      </w:r>
-      <w:r>
-        <w:rPr>
-          <w:rFonts w:ascii="Consolas" w:hAnsi="Consolas"/>
-          <w:color w:val="FF0000"/>
-        </w:rPr>
-        <w:t>T?</w:t>
-      </w:r>
-      <w:r>
-        <w:rPr>
-          <w:rFonts w:ascii="Consolas" w:hAnsi="Consolas"/>
-          <w:color w:val="00B050"/>
-        </w:rPr>
-        <w:t xml:space="preserve"> </w:t>
-      </w:r>
-      <w:r>
-        <w:rPr>
-          <w:rFonts w:ascii="Consolas" w:hAnsi="Consolas"/>
-          <w:color w:val="00B050"/>
-        </w:rPr>
-        <w:t>signifie que la méthode peut retourner</w:t>
+        <w:t xml:space="preserve"> signifie que la méthode peut retourner</w:t>
       </w:r>
       <w:r>
         <w:rPr>
@@ -6822,7 +6503,15 @@
       </w:r>
       <w:proofErr w:type="spellEnd"/>
       <w:r>
-        <w:t>&lt;ZombieType&gt;? Ça nous</w:t>
+        <w:t>&lt;</w:t>
+      </w:r>
+      <w:proofErr w:type="spellStart"/>
+      <w:r>
+        <w:t>ZombieType</w:t>
+      </w:r>
+      <w:proofErr w:type="spellEnd"/>
+      <w:r>
+        <w:t>&gt;? Ça nous</w:t>
       </w:r>
       <w:r>
         <w:t xml:space="preserve"> </w:t>
@@ -7268,7 +6957,15 @@
       </w:r>
       <w:proofErr w:type="spellEnd"/>
       <w:r>
-        <w:t xml:space="preserve">&lt;ZombieType&gt;, </w:t>
+        <w:t>&lt;</w:t>
+      </w:r>
+      <w:proofErr w:type="spellStart"/>
+      <w:r>
+        <w:t>ZombieType</w:t>
+      </w:r>
+      <w:proofErr w:type="spellEnd"/>
+      <w:r>
+        <w:t xml:space="preserve">&gt;, </w:t>
       </w:r>
       <w:proofErr w:type="spellStart"/>
       <w:r>
@@ -11105,14 +10802,12 @@
         <w:spacing w:before="0" w:after="0"/>
         <w:rPr>
           <w:rFonts w:ascii="Consolas" w:hAnsi="Consolas"/>
-          <w:color w:val="FFE599" w:themeColor="accent4" w:themeTint="66"/>
-          <w:lang w:val="en-CA"/>
-        </w:rPr>
-      </w:pPr>
-      <w:r>
-        <w:rPr>
-          <w:rFonts w:ascii="Consolas" w:hAnsi="Consolas"/>
-          <w:color w:val="FFE599" w:themeColor="accent4" w:themeTint="66"/>
+          <w:lang w:val="en-CA"/>
+        </w:rPr>
+      </w:pPr>
+      <w:r>
+        <w:rPr>
+          <w:rFonts w:ascii="Consolas" w:hAnsi="Consolas"/>
           <w:lang w:val="en-CA"/>
         </w:rPr>
         <w:t xml:space="preserve">public bool </w:t>
@@ -11122,7 +10817,6 @@
       <w:r>
         <w:rPr>
           <w:rFonts w:ascii="Consolas" w:hAnsi="Consolas"/>
-          <w:color w:val="FFE599" w:themeColor="accent4" w:themeTint="66"/>
           <w:lang w:val="en-CA"/>
         </w:rPr>
         <w:t>HasAssociatedZombies</w:t>
@@ -11131,7 +10825,6 @@
       <w:r>
         <w:rPr>
           <w:rFonts w:ascii="Consolas" w:hAnsi="Consolas"/>
-          <w:color w:val="FFE599" w:themeColor="accent4" w:themeTint="66"/>
           <w:lang w:val="en-CA"/>
         </w:rPr>
         <w:t>(</w:t>
@@ -11140,7 +10833,6 @@
       <w:r>
         <w:rPr>
           <w:rFonts w:ascii="Consolas" w:hAnsi="Consolas"/>
-          <w:color w:val="FFE599" w:themeColor="accent4" w:themeTint="66"/>
           <w:lang w:val="en-CA"/>
         </w:rPr>
         <w:t>int id)</w:t>
@@ -11161,7 +10853,6 @@
         <w:spacing w:before="0" w:after="0" w:line="240" w:lineRule="auto"/>
         <w:rPr>
           <w:rFonts w:ascii="Consolas" w:hAnsi="Consolas" w:cs="Cascadia Mono"/>
-          <w:color w:val="FFE599" w:themeColor="accent4" w:themeTint="66"/>
           <w:sz w:val="22"/>
           <w:szCs w:val="22"/>
           <w:lang w:val="en-CA"/>
@@ -11170,7 +10861,6 @@
       <w:r>
         <w:rPr>
           <w:rFonts w:ascii="Consolas" w:hAnsi="Consolas" w:cs="Cascadia Mono"/>
-          <w:color w:val="FFE599" w:themeColor="accent4" w:themeTint="66"/>
           <w:sz w:val="22"/>
           <w:szCs w:val="22"/>
           <w:lang w:val="en-CA"/>
@@ -11193,7 +10883,6 @@
         <w:spacing w:before="0" w:after="0" w:line="240" w:lineRule="auto"/>
         <w:rPr>
           <w:rFonts w:ascii="Consolas" w:hAnsi="Consolas" w:cs="Cascadia Mono"/>
-          <w:color w:val="FFE599" w:themeColor="accent4" w:themeTint="66"/>
           <w:sz w:val="22"/>
           <w:szCs w:val="22"/>
           <w:lang w:val="en-CA"/>
@@ -11202,7 +10891,6 @@
       <w:r>
         <w:rPr>
           <w:rFonts w:ascii="Consolas" w:hAnsi="Consolas" w:cs="Cascadia Mono"/>
-          <w:color w:val="FFE599" w:themeColor="accent4" w:themeTint="66"/>
           <w:sz w:val="22"/>
           <w:szCs w:val="22"/>
           <w:lang w:val="en-CA"/>
@@ -11212,7 +10900,6 @@
       <w:r>
         <w:rPr>
           <w:rFonts w:ascii="Consolas" w:hAnsi="Consolas" w:cs="Cascadia Mono"/>
-          <w:color w:val="FFE599" w:themeColor="accent4" w:themeTint="66"/>
           <w:sz w:val="22"/>
           <w:szCs w:val="22"/>
           <w:lang w:val="en-CA"/>
@@ -11223,7 +10910,6 @@
       <w:r>
         <w:rPr>
           <w:rFonts w:ascii="Consolas" w:hAnsi="Consolas" w:cs="Cascadia Mono"/>
-          <w:color w:val="FFE599" w:themeColor="accent4" w:themeTint="66"/>
           <w:sz w:val="22"/>
           <w:szCs w:val="22"/>
           <w:lang w:val="en-CA"/>
@@ -11234,7 +10920,6 @@
       <w:r>
         <w:rPr>
           <w:rFonts w:ascii="Consolas" w:hAnsi="Consolas" w:cs="Cascadia Mono"/>
-          <w:color w:val="FFE599" w:themeColor="accent4" w:themeTint="66"/>
           <w:sz w:val="22"/>
           <w:szCs w:val="22"/>
           <w:lang w:val="en-CA"/>
@@ -11245,7 +10930,6 @@
       <w:r>
         <w:rPr>
           <w:rFonts w:ascii="Consolas" w:hAnsi="Consolas" w:cs="Cascadia Mono"/>
-          <w:color w:val="FFE599" w:themeColor="accent4" w:themeTint="66"/>
           <w:sz w:val="22"/>
           <w:szCs w:val="22"/>
           <w:lang w:val="en-CA"/>
@@ -11256,7 +10940,6 @@
       <w:r>
         <w:rPr>
           <w:rFonts w:ascii="Consolas" w:hAnsi="Consolas" w:cs="Cascadia Mono"/>
-          <w:color w:val="FFE599" w:themeColor="accent4" w:themeTint="66"/>
           <w:sz w:val="22"/>
           <w:szCs w:val="22"/>
           <w:lang w:val="en-CA"/>
@@ -11268,7 +10951,6 @@
       <w:r>
         <w:rPr>
           <w:rFonts w:ascii="Consolas" w:hAnsi="Consolas" w:cs="Cascadia Mono"/>
-          <w:color w:val="FFE599" w:themeColor="accent4" w:themeTint="66"/>
           <w:sz w:val="22"/>
           <w:szCs w:val="22"/>
           <w:lang w:val="en-CA"/>
@@ -11280,7 +10962,6 @@
       <w:r>
         <w:rPr>
           <w:rFonts w:ascii="Consolas" w:hAnsi="Consolas" w:cs="Cascadia Mono"/>
-          <w:color w:val="FFE599" w:themeColor="accent4" w:themeTint="66"/>
           <w:sz w:val="22"/>
           <w:szCs w:val="22"/>
           <w:lang w:val="en-CA"/>
@@ -11292,7 +10973,6 @@
       <w:r>
         <w:rPr>
           <w:rFonts w:ascii="Consolas" w:hAnsi="Consolas" w:cs="Cascadia Mono"/>
-          <w:color w:val="FFE599" w:themeColor="accent4" w:themeTint="66"/>
           <w:sz w:val="22"/>
           <w:szCs w:val="22"/>
           <w:lang w:val="en-CA"/>
@@ -11303,7 +10983,6 @@
       <w:r>
         <w:rPr>
           <w:rFonts w:ascii="Consolas" w:hAnsi="Consolas" w:cs="Cascadia Mono"/>
-          <w:color w:val="FFE599" w:themeColor="accent4" w:themeTint="66"/>
           <w:sz w:val="22"/>
           <w:szCs w:val="22"/>
           <w:lang w:val="en-CA"/>
@@ -11314,7 +10993,6 @@
       <w:r>
         <w:rPr>
           <w:rFonts w:ascii="Consolas" w:hAnsi="Consolas" w:cs="Cascadia Mono"/>
-          <w:color w:val="FFE599" w:themeColor="accent4" w:themeTint="66"/>
           <w:sz w:val="22"/>
           <w:szCs w:val="22"/>
           <w:lang w:val="en-CA"/>
@@ -11337,7 +11015,6 @@
         <w:spacing w:before="0" w:after="0" w:line="240" w:lineRule="auto"/>
         <w:rPr>
           <w:rFonts w:ascii="Consolas" w:hAnsi="Consolas" w:cs="Cascadia Mono"/>
-          <w:color w:val="FFE599" w:themeColor="accent4" w:themeTint="66"/>
           <w:sz w:val="22"/>
           <w:szCs w:val="22"/>
         </w:rPr>
@@ -11345,7 +11022,6 @@
       <w:r>
         <w:rPr>
           <w:rFonts w:ascii="Consolas" w:hAnsi="Consolas" w:cs="Cascadia Mono"/>
-          <w:color w:val="FFE599" w:themeColor="accent4" w:themeTint="66"/>
           <w:sz w:val="22"/>
           <w:szCs w:val="22"/>
           <w:lang w:val="en-CA"/>
@@ -11356,7 +11032,6 @@
       <w:r>
         <w:rPr>
           <w:rFonts w:ascii="Consolas" w:hAnsi="Consolas" w:cs="Cascadia Mono"/>
-          <w:color w:val="FFE599" w:themeColor="accent4" w:themeTint="66"/>
           <w:sz w:val="22"/>
           <w:szCs w:val="22"/>
         </w:rPr>
@@ -11366,7 +11041,6 @@
       <w:r>
         <w:rPr>
           <w:rFonts w:ascii="Consolas" w:hAnsi="Consolas" w:cs="Cascadia Mono"/>
-          <w:color w:val="FFE599" w:themeColor="accent4" w:themeTint="66"/>
           <w:sz w:val="22"/>
           <w:szCs w:val="22"/>
         </w:rPr>
@@ -11376,7 +11050,6 @@
       <w:r>
         <w:rPr>
           <w:rFonts w:ascii="Consolas" w:hAnsi="Consolas" w:cs="Cascadia Mono"/>
-          <w:color w:val="FFE599" w:themeColor="accent4" w:themeTint="66"/>
           <w:sz w:val="22"/>
           <w:szCs w:val="22"/>
         </w:rPr>
@@ -11386,7 +11059,6 @@
       <w:r>
         <w:rPr>
           <w:rFonts w:ascii="Consolas" w:hAnsi="Consolas" w:cs="Cascadia Mono"/>
-          <w:color w:val="FFE599" w:themeColor="accent4" w:themeTint="66"/>
           <w:sz w:val="22"/>
           <w:szCs w:val="22"/>
         </w:rPr>
@@ -11410,13 +11082,11 @@
         <w:spacing w:before="0" w:after="0"/>
         <w:rPr>
           <w:rFonts w:ascii="Consolas" w:hAnsi="Consolas"/>
-          <w:color w:val="FFE599" w:themeColor="accent4" w:themeTint="66"/>
-        </w:rPr>
-      </w:pPr>
-      <w:r>
-        <w:rPr>
-          <w:rFonts w:ascii="Consolas" w:hAnsi="Consolas"/>
-          <w:color w:val="FFE599" w:themeColor="accent4" w:themeTint="66"/>
+        </w:rPr>
+      </w:pPr>
+      <w:r>
+        <w:rPr>
+          <w:rFonts w:ascii="Consolas" w:hAnsi="Consolas"/>
         </w:rPr>
         <w:t>}</w:t>
       </w:r>
@@ -11618,7 +11288,6 @@
         <w:spacing w:before="0" w:after="0" w:line="240" w:lineRule="auto"/>
         <w:rPr>
           <w:rFonts w:ascii="Consolas" w:hAnsi="Consolas" w:cs="Cascadia Mono"/>
-          <w:color w:val="FFE599" w:themeColor="accent4" w:themeTint="66"/>
           <w:sz w:val="22"/>
           <w:szCs w:val="22"/>
           <w:lang w:val="en-CA"/>
@@ -11627,7 +11296,6 @@
       <w:r>
         <w:rPr>
           <w:rFonts w:ascii="Consolas" w:hAnsi="Consolas" w:cs="Cascadia Mono"/>
-          <w:color w:val="FFE599" w:themeColor="accent4" w:themeTint="66"/>
           <w:sz w:val="22"/>
           <w:szCs w:val="22"/>
           <w:lang w:val="en-CA"/>
@@ -11637,7 +11305,6 @@
       <w:r>
         <w:rPr>
           <w:rFonts w:ascii="Consolas" w:hAnsi="Consolas" w:cs="Cascadia Mono"/>
-          <w:color w:val="FFE599" w:themeColor="accent4" w:themeTint="66"/>
           <w:sz w:val="22"/>
           <w:szCs w:val="22"/>
           <w:lang w:val="en-CA"/>
@@ -11647,7 +11314,6 @@
       <w:r>
         <w:rPr>
           <w:rFonts w:ascii="Consolas" w:hAnsi="Consolas" w:cs="Cascadia Mono"/>
-          <w:color w:val="FFE599" w:themeColor="accent4" w:themeTint="66"/>
           <w:sz w:val="22"/>
           <w:szCs w:val="22"/>
           <w:lang w:val="en-CA"/>
@@ -11659,7 +11325,6 @@
       <w:r>
         <w:rPr>
           <w:rFonts w:ascii="Consolas" w:hAnsi="Consolas" w:cs="Cascadia Mono"/>
-          <w:color w:val="FFE599" w:themeColor="accent4" w:themeTint="66"/>
           <w:sz w:val="22"/>
           <w:szCs w:val="22"/>
           <w:lang w:val="en-CA"/>
@@ -11670,7 +11335,6 @@
       <w:r>
         <w:rPr>
           <w:rFonts w:ascii="Consolas" w:hAnsi="Consolas" w:cs="Cascadia Mono"/>
-          <w:color w:val="FFE599" w:themeColor="accent4" w:themeTint="66"/>
           <w:sz w:val="22"/>
           <w:szCs w:val="22"/>
           <w:lang w:val="en-CA"/>
@@ -11681,7 +11345,6 @@
       <w:r>
         <w:rPr>
           <w:rFonts w:ascii="Consolas" w:hAnsi="Consolas" w:cs="Cascadia Mono"/>
-          <w:color w:val="FFE599" w:themeColor="accent4" w:themeTint="66"/>
           <w:sz w:val="22"/>
           <w:szCs w:val="22"/>
           <w:lang w:val="en-CA"/>
@@ -11704,7 +11367,6 @@
         <w:spacing w:before="0" w:after="0" w:line="240" w:lineRule="auto"/>
         <w:rPr>
           <w:rFonts w:ascii="Consolas" w:hAnsi="Consolas" w:cs="Cascadia Mono"/>
-          <w:color w:val="FFE599" w:themeColor="accent4" w:themeTint="66"/>
           <w:sz w:val="22"/>
           <w:szCs w:val="22"/>
           <w:lang w:val="en-CA"/>
@@ -11713,7 +11375,6 @@
       <w:r>
         <w:rPr>
           <w:rFonts w:ascii="Consolas" w:hAnsi="Consolas" w:cs="Cascadia Mono"/>
-          <w:color w:val="FFE599" w:themeColor="accent4" w:themeTint="66"/>
           <w:sz w:val="22"/>
           <w:szCs w:val="22"/>
           <w:lang w:val="en-CA"/>
@@ -11736,7 +11397,6 @@
         <w:spacing w:before="0" w:after="0" w:line="240" w:lineRule="auto"/>
         <w:rPr>
           <w:rFonts w:ascii="Consolas" w:hAnsi="Consolas" w:cs="Cascadia Mono"/>
-          <w:color w:val="FFE599" w:themeColor="accent4" w:themeTint="66"/>
           <w:sz w:val="22"/>
           <w:szCs w:val="22"/>
           <w:lang w:val="en-CA"/>
@@ -11745,7 +11405,6 @@
       <w:r>
         <w:rPr>
           <w:rFonts w:ascii="Consolas" w:hAnsi="Consolas" w:cs="Cascadia Mono"/>
-          <w:color w:val="FFE599" w:themeColor="accent4" w:themeTint="66"/>
           <w:sz w:val="22"/>
           <w:szCs w:val="22"/>
           <w:lang w:val="en-CA"/>
@@ -11756,7 +11415,6 @@
       <w:r>
         <w:rPr>
           <w:rFonts w:ascii="Consolas" w:hAnsi="Consolas" w:cs="Cascadia Mono"/>
-          <w:color w:val="FFE599" w:themeColor="accent4" w:themeTint="66"/>
           <w:sz w:val="22"/>
           <w:szCs w:val="22"/>
           <w:lang w:val="en-CA"/>
@@ -11767,7 +11425,6 @@
       <w:r>
         <w:rPr>
           <w:rFonts w:ascii="Consolas" w:hAnsi="Consolas" w:cs="Cascadia Mono"/>
-          <w:color w:val="FFE599" w:themeColor="accent4" w:themeTint="66"/>
           <w:sz w:val="22"/>
           <w:szCs w:val="22"/>
           <w:lang w:val="en-CA"/>
@@ -11779,7 +11436,6 @@
       <w:r>
         <w:rPr>
           <w:rFonts w:ascii="Consolas" w:hAnsi="Consolas" w:cs="Cascadia Mono"/>
-          <w:color w:val="FFE599" w:themeColor="accent4" w:themeTint="66"/>
           <w:sz w:val="22"/>
           <w:szCs w:val="22"/>
           <w:lang w:val="en-CA"/>
@@ -11791,7 +11447,6 @@
       <w:r>
         <w:rPr>
           <w:rFonts w:ascii="Consolas" w:hAnsi="Consolas" w:cs="Cascadia Mono"/>
-          <w:color w:val="FFE599" w:themeColor="accent4" w:themeTint="66"/>
           <w:sz w:val="22"/>
           <w:szCs w:val="22"/>
           <w:lang w:val="en-CA"/>
@@ -11814,7 +11469,6 @@
         <w:spacing w:before="0" w:after="0" w:line="240" w:lineRule="auto"/>
         <w:rPr>
           <w:rFonts w:ascii="Consolas" w:hAnsi="Consolas" w:cs="Cascadia Mono"/>
-          <w:color w:val="FFE599" w:themeColor="accent4" w:themeTint="66"/>
           <w:sz w:val="22"/>
           <w:szCs w:val="22"/>
           <w:lang w:val="en-CA"/>
@@ -11823,7 +11477,6 @@
       <w:r>
         <w:rPr>
           <w:rFonts w:ascii="Consolas" w:hAnsi="Consolas" w:cs="Cascadia Mono"/>
-          <w:color w:val="FFE599" w:themeColor="accent4" w:themeTint="66"/>
           <w:sz w:val="22"/>
           <w:szCs w:val="22"/>
           <w:lang w:val="en-CA"/>
@@ -11834,7 +11487,6 @@
       <w:r>
         <w:rPr>
           <w:rFonts w:ascii="Consolas" w:hAnsi="Consolas" w:cs="Cascadia Mono"/>
-          <w:color w:val="FFE599" w:themeColor="accent4" w:themeTint="66"/>
           <w:sz w:val="22"/>
           <w:szCs w:val="22"/>
           <w:lang w:val="en-CA"/>
@@ -11845,7 +11497,6 @@
       <w:r>
         <w:rPr>
           <w:rFonts w:ascii="Consolas" w:hAnsi="Consolas" w:cs="Cascadia Mono"/>
-          <w:color w:val="FFE599" w:themeColor="accent4" w:themeTint="66"/>
           <w:sz w:val="22"/>
           <w:szCs w:val="22"/>
           <w:lang w:val="en-CA"/>
@@ -11868,7 +11519,6 @@
         <w:spacing w:before="0" w:after="0" w:line="240" w:lineRule="auto"/>
         <w:rPr>
           <w:rFonts w:ascii="Consolas" w:hAnsi="Consolas" w:cs="Cascadia Mono"/>
-          <w:color w:val="FFE599" w:themeColor="accent4" w:themeTint="66"/>
           <w:sz w:val="22"/>
           <w:szCs w:val="22"/>
           <w:lang w:val="en-CA"/>
@@ -11877,7 +11527,6 @@
       <w:r>
         <w:rPr>
           <w:rFonts w:ascii="Consolas" w:hAnsi="Consolas" w:cs="Cascadia Mono"/>
-          <w:color w:val="FFE599" w:themeColor="accent4" w:themeTint="66"/>
           <w:sz w:val="22"/>
           <w:szCs w:val="22"/>
           <w:lang w:val="en-CA"/>
@@ -11900,7 +11549,6 @@
         <w:spacing w:before="0" w:after="0" w:line="240" w:lineRule="auto"/>
         <w:rPr>
           <w:rFonts w:ascii="Consolas" w:hAnsi="Consolas" w:cs="Cascadia Mono"/>
-          <w:color w:val="FFE599" w:themeColor="accent4" w:themeTint="66"/>
           <w:sz w:val="22"/>
           <w:szCs w:val="22"/>
         </w:rPr>
@@ -11908,7 +11556,6 @@
       <w:r>
         <w:rPr>
           <w:rFonts w:ascii="Consolas" w:hAnsi="Consolas" w:cs="Cascadia Mono"/>
-          <w:color w:val="FFE599" w:themeColor="accent4" w:themeTint="66"/>
           <w:sz w:val="22"/>
           <w:szCs w:val="22"/>
         </w:rPr>
@@ -11918,7 +11565,6 @@
       <w:r>
         <w:rPr>
           <w:rFonts w:ascii="Consolas" w:hAnsi="Consolas" w:cs="Cascadia Mono"/>
-          <w:color w:val="FFE599" w:themeColor="accent4" w:themeTint="66"/>
           <w:sz w:val="22"/>
           <w:szCs w:val="22"/>
         </w:rPr>
@@ -11928,7 +11574,6 @@
       <w:r>
         <w:rPr>
           <w:rFonts w:ascii="Consolas" w:hAnsi="Consolas" w:cs="Cascadia Mono"/>
-          <w:color w:val="FFE599" w:themeColor="accent4" w:themeTint="66"/>
           <w:sz w:val="22"/>
           <w:szCs w:val="22"/>
         </w:rPr>
@@ -11938,7 +11583,6 @@
       <w:r>
         <w:rPr>
           <w:rFonts w:ascii="Consolas" w:hAnsi="Consolas" w:cs="Cascadia Mono"/>
-          <w:color w:val="FFE599" w:themeColor="accent4" w:themeTint="66"/>
           <w:sz w:val="22"/>
           <w:szCs w:val="22"/>
         </w:rPr>
@@ -11948,7 +11592,6 @@
       <w:r>
         <w:rPr>
           <w:rFonts w:ascii="Consolas" w:hAnsi="Consolas" w:cs="Cascadia Mono"/>
-          <w:color w:val="FFE599" w:themeColor="accent4" w:themeTint="66"/>
           <w:sz w:val="22"/>
           <w:szCs w:val="22"/>
         </w:rPr>
@@ -11957,7 +11600,6 @@
       <w:r>
         <w:rPr>
           <w:rFonts w:ascii="Consolas" w:hAnsi="Consolas" w:cs="Cascadia Mono"/>
-          <w:color w:val="FFE599" w:themeColor="accent4" w:themeTint="66"/>
           <w:sz w:val="22"/>
           <w:szCs w:val="22"/>
         </w:rPr>
@@ -11979,7 +11621,6 @@
         <w:spacing w:before="0" w:after="0" w:line="240" w:lineRule="auto"/>
         <w:rPr>
           <w:rFonts w:ascii="Consolas" w:hAnsi="Consolas" w:cs="Cascadia Mono"/>
-          <w:color w:val="FFE599" w:themeColor="accent4" w:themeTint="66"/>
           <w:sz w:val="22"/>
           <w:szCs w:val="22"/>
         </w:rPr>
@@ -11987,7 +11628,6 @@
       <w:r>
         <w:rPr>
           <w:rFonts w:ascii="Consolas" w:hAnsi="Consolas" w:cs="Cascadia Mono"/>
-          <w:color w:val="FFE599" w:themeColor="accent4" w:themeTint="66"/>
           <w:sz w:val="22"/>
           <w:szCs w:val="22"/>
         </w:rPr>
@@ -12009,16 +11649,13 @@
         <w:spacing w:before="0" w:after="0" w:line="240" w:lineRule="auto"/>
         <w:rPr>
           <w:rFonts w:ascii="Consolas" w:hAnsi="Consolas" w:cs="Cascadia Mono"/>
-          <w:color w:val="FFE599" w:themeColor="accent4" w:themeTint="66"/>
           <w:sz w:val="22"/>
           <w:szCs w:val="22"/>
-          <w:lang w:val="en-CA"/>
         </w:rPr>
       </w:pPr>
       <w:r>
         <w:rPr>
           <w:rFonts w:ascii="Consolas" w:hAnsi="Consolas" w:cs="Cascadia Mono"/>
-          <w:color w:val="FFE599" w:themeColor="accent4" w:themeTint="66"/>
           <w:sz w:val="22"/>
           <w:szCs w:val="22"/>
         </w:rPr>
@@ -12028,10 +11665,8 @@
       <w:r>
         <w:rPr>
           <w:rFonts w:ascii="Consolas" w:hAnsi="Consolas" w:cs="Cascadia Mono"/>
-          <w:color w:val="FFE599" w:themeColor="accent4" w:themeTint="66"/>
           <w:sz w:val="22"/>
           <w:szCs w:val="22"/>
-          <w:lang w:val="en-CA"/>
         </w:rPr>
         <w:t>zombieType.IsDisponible</w:t>
       </w:r>
@@ -12039,10 +11674,8 @@
       <w:r>
         <w:rPr>
           <w:rFonts w:ascii="Consolas" w:hAnsi="Consolas" w:cs="Cascadia Mono"/>
-          <w:color w:val="FFE599" w:themeColor="accent4" w:themeTint="66"/>
           <w:sz w:val="22"/>
           <w:szCs w:val="22"/>
-          <w:lang w:val="en-CA"/>
         </w:rPr>
         <w:t xml:space="preserve"> = false;</w:t>
       </w:r>
@@ -12062,65 +11695,73 @@
         <w:spacing w:before="0" w:after="0" w:line="240" w:lineRule="auto"/>
         <w:rPr>
           <w:rFonts w:ascii="Consolas" w:hAnsi="Consolas" w:cs="Cascadia Mono"/>
-          <w:color w:val="FFE599" w:themeColor="accent4" w:themeTint="66"/>
           <w:sz w:val="22"/>
           <w:szCs w:val="22"/>
-          <w:lang w:val="en-CA"/>
         </w:rPr>
       </w:pPr>
       <w:r>
         <w:rPr>
           <w:rFonts w:ascii="Consolas" w:hAnsi="Consolas" w:cs="Cascadia Mono"/>
-          <w:color w:val="FFE599" w:themeColor="accent4" w:themeTint="66"/>
           <w:sz w:val="22"/>
           <w:szCs w:val="22"/>
-          <w:lang w:val="en-CA"/>
-        </w:rPr>
-        <w:t xml:space="preserve">        await </w:t>
+        </w:rPr>
+        <w:t xml:space="preserve">        </w:t>
       </w:r>
       <w:proofErr w:type="spellStart"/>
       <w:proofErr w:type="gramStart"/>
       <w:r>
         <w:rPr>
           <w:rFonts w:ascii="Consolas" w:hAnsi="Consolas" w:cs="Cascadia Mono"/>
-          <w:color w:val="FFE599" w:themeColor="accent4" w:themeTint="66"/>
           <w:sz w:val="22"/>
           <w:szCs w:val="22"/>
-          <w:lang w:val="en-CA"/>
-        </w:rPr>
-        <w:t>this.EditAsync</w:t>
+        </w:rPr>
+        <w:t>await</w:t>
       </w:r>
       <w:proofErr w:type="spellEnd"/>
       <w:proofErr w:type="gramEnd"/>
       <w:r>
         <w:rPr>
           <w:rFonts w:ascii="Consolas" w:hAnsi="Consolas" w:cs="Cascadia Mono"/>
-          <w:color w:val="FFE599" w:themeColor="accent4" w:themeTint="66"/>
           <w:sz w:val="22"/>
           <w:szCs w:val="22"/>
-          <w:lang w:val="en-CA"/>
-        </w:rPr>
-        <w:t>(</w:t>
-      </w:r>
-      <w:proofErr w:type="spellStart"/>
+        </w:rPr>
+        <w:t xml:space="preserve"> </w:t>
+      </w:r>
+      <w:proofErr w:type="spellStart"/>
+      <w:proofErr w:type="gramStart"/>
       <w:r>
         <w:rPr>
           <w:rFonts w:ascii="Consolas" w:hAnsi="Consolas" w:cs="Cascadia Mono"/>
-          <w:color w:val="FFE599" w:themeColor="accent4" w:themeTint="66"/>
           <w:sz w:val="22"/>
           <w:szCs w:val="22"/>
-          <w:lang w:val="en-CA"/>
-        </w:rPr>
-        <w:t>zombieType</w:t>
-      </w:r>
-      <w:proofErr w:type="spellEnd"/>
+        </w:rPr>
+        <w:t>this.EditAsync</w:t>
+      </w:r>
+      <w:proofErr w:type="spellEnd"/>
+      <w:proofErr w:type="gramEnd"/>
       <w:r>
         <w:rPr>
           <w:rFonts w:ascii="Consolas" w:hAnsi="Consolas" w:cs="Cascadia Mono"/>
-          <w:color w:val="FFE599" w:themeColor="accent4" w:themeTint="66"/>
           <w:sz w:val="22"/>
           <w:szCs w:val="22"/>
-          <w:lang w:val="en-CA"/>
+        </w:rPr>
+        <w:t>(</w:t>
+      </w:r>
+      <w:proofErr w:type="spellStart"/>
+      <w:r>
+        <w:rPr>
+          <w:rFonts w:ascii="Consolas" w:hAnsi="Consolas" w:cs="Cascadia Mono"/>
+          <w:sz w:val="22"/>
+          <w:szCs w:val="22"/>
+        </w:rPr>
+        <w:t>zombieType</w:t>
+      </w:r>
+      <w:proofErr w:type="spellEnd"/>
+      <w:r>
+        <w:rPr>
+          <w:rFonts w:ascii="Consolas" w:hAnsi="Consolas" w:cs="Cascadia Mono"/>
+          <w:sz w:val="22"/>
+          <w:szCs w:val="22"/>
         </w:rPr>
         <w:t>);</w:t>
       </w:r>
@@ -12140,19 +11781,15 @@
         <w:spacing w:before="0" w:after="0" w:line="240" w:lineRule="auto"/>
         <w:rPr>
           <w:rFonts w:ascii="Consolas" w:hAnsi="Consolas" w:cs="Cascadia Mono"/>
-          <w:color w:val="FFE599" w:themeColor="accent4" w:themeTint="66"/>
           <w:sz w:val="22"/>
           <w:szCs w:val="22"/>
-          <w:lang w:val="en-CA"/>
         </w:rPr>
       </w:pPr>
       <w:r>
         <w:rPr>
           <w:rFonts w:ascii="Consolas" w:hAnsi="Consolas" w:cs="Cascadia Mono"/>
-          <w:color w:val="FFE599" w:themeColor="accent4" w:themeTint="66"/>
           <w:sz w:val="22"/>
           <w:szCs w:val="22"/>
-          <w:lang w:val="en-CA"/>
         </w:rPr>
         <w:t xml:space="preserve">    }</w:t>
       </w:r>
@@ -12172,7 +11809,6 @@
         <w:spacing w:before="0" w:after="0" w:line="240" w:lineRule="auto"/>
         <w:rPr>
           <w:rFonts w:ascii="Consolas" w:hAnsi="Consolas" w:cs="Cascadia Mono"/>
-          <w:color w:val="FFE599" w:themeColor="accent4" w:themeTint="66"/>
           <w:sz w:val="22"/>
           <w:szCs w:val="22"/>
         </w:rPr>
@@ -12180,7 +11816,6 @@
       <w:r>
         <w:rPr>
           <w:rFonts w:ascii="Consolas" w:hAnsi="Consolas" w:cs="Cascadia Mono"/>
-          <w:color w:val="FFE599" w:themeColor="accent4" w:themeTint="66"/>
           <w:sz w:val="22"/>
           <w:szCs w:val="22"/>
         </w:rPr>
@@ -12191,7 +11826,6 @@
       <w:r>
         <w:rPr>
           <w:rFonts w:ascii="Consolas" w:hAnsi="Consolas" w:cs="Cascadia Mono"/>
-          <w:color w:val="FFE599" w:themeColor="accent4" w:themeTint="66"/>
           <w:sz w:val="22"/>
           <w:szCs w:val="22"/>
         </w:rPr>
@@ -12200,7 +11834,6 @@
       <w:r>
         <w:rPr>
           <w:rFonts w:ascii="Consolas" w:hAnsi="Consolas" w:cs="Cascadia Mono"/>
-          <w:color w:val="FFE599" w:themeColor="accent4" w:themeTint="66"/>
           <w:sz w:val="22"/>
           <w:szCs w:val="22"/>
         </w:rPr>
@@ -12211,11 +11844,28 @@
       <w:r>
         <w:rPr>
           <w:rFonts w:ascii="Consolas" w:hAnsi="Consolas" w:cs="Cascadia Mono"/>
-          <w:color w:val="FFE599" w:themeColor="accent4" w:themeTint="66"/>
           <w:sz w:val="22"/>
           <w:szCs w:val="22"/>
         </w:rPr>
-        <w:t xml:space="preserve">                          // Sinon on supprime le ZombieType</w:t>
+        <w:t xml:space="preserve">                          /</w:t>
+      </w:r>
+      <w:r>
+        <w:rPr>
+          <w:rFonts w:ascii="Consolas" w:hAnsi="Consolas" w:cs="Cascadia Mono"/>
+          <w:i/>
+          <w:iCs/>
+          <w:sz w:val="22"/>
+          <w:szCs w:val="22"/>
+        </w:rPr>
+        <w:t xml:space="preserve">/ </w:t>
+      </w:r>
+      <w:r>
+        <w:rPr>
+          <w:rFonts w:ascii="Consolas" w:hAnsi="Consolas" w:cs="Cascadia Mono"/>
+          <w:sz w:val="22"/>
+          <w:szCs w:val="22"/>
+        </w:rPr>
+        <w:t>Sinon on supprime le ZombieType</w:t>
       </w:r>
     </w:p>
     <w:p>
@@ -12233,7 +11883,6 @@
         <w:spacing w:before="0" w:after="0" w:line="240" w:lineRule="auto"/>
         <w:rPr>
           <w:rFonts w:ascii="Consolas" w:hAnsi="Consolas" w:cs="Cascadia Mono"/>
-          <w:color w:val="FFE599" w:themeColor="accent4" w:themeTint="66"/>
           <w:sz w:val="22"/>
           <w:szCs w:val="22"/>
         </w:rPr>
@@ -12241,7 +11890,6 @@
       <w:r>
         <w:rPr>
           <w:rFonts w:ascii="Consolas" w:hAnsi="Consolas" w:cs="Cascadia Mono"/>
-          <w:color w:val="FFE599" w:themeColor="accent4" w:themeTint="66"/>
           <w:sz w:val="22"/>
           <w:szCs w:val="22"/>
         </w:rPr>
@@ -12263,7 +11911,6 @@
         <w:spacing w:before="0" w:after="0" w:line="240" w:lineRule="auto"/>
         <w:rPr>
           <w:rFonts w:ascii="Consolas" w:hAnsi="Consolas" w:cs="Cascadia Mono"/>
-          <w:color w:val="FFE599" w:themeColor="accent4" w:themeTint="66"/>
           <w:sz w:val="22"/>
           <w:szCs w:val="22"/>
         </w:rPr>
@@ -12271,7 +11918,6 @@
       <w:r>
         <w:rPr>
           <w:rFonts w:ascii="Consolas" w:hAnsi="Consolas" w:cs="Cascadia Mono"/>
-          <w:color w:val="FFE599" w:themeColor="accent4" w:themeTint="66"/>
           <w:sz w:val="22"/>
           <w:szCs w:val="22"/>
         </w:rPr>
@@ -12280,7 +11926,6 @@
       <w:r>
         <w:rPr>
           <w:rFonts w:ascii="Consolas" w:hAnsi="Consolas" w:cs="Cascadia Mono"/>
-          <w:color w:val="FFE599" w:themeColor="accent4" w:themeTint="66"/>
           <w:sz w:val="22"/>
           <w:szCs w:val="22"/>
         </w:rPr>
@@ -12291,7 +11936,6 @@
       <w:r>
         <w:rPr>
           <w:rFonts w:ascii="Consolas" w:hAnsi="Consolas" w:cs="Cascadia Mono"/>
-          <w:color w:val="FFE599" w:themeColor="accent4" w:themeTint="66"/>
           <w:sz w:val="22"/>
           <w:szCs w:val="22"/>
         </w:rPr>
@@ -12302,7 +11946,6 @@
       <w:r>
         <w:rPr>
           <w:rFonts w:ascii="Consolas" w:hAnsi="Consolas" w:cs="Cascadia Mono"/>
-          <w:color w:val="FFE599" w:themeColor="accent4" w:themeTint="66"/>
           <w:sz w:val="22"/>
           <w:szCs w:val="22"/>
         </w:rPr>
@@ -12313,7 +11956,6 @@
       <w:r>
         <w:rPr>
           <w:rFonts w:ascii="Consolas" w:hAnsi="Consolas" w:cs="Cascadia Mono"/>
-          <w:color w:val="FFE599" w:themeColor="accent4" w:themeTint="66"/>
           <w:sz w:val="22"/>
           <w:szCs w:val="22"/>
         </w:rPr>
@@ -12324,7 +11966,6 @@
       <w:r>
         <w:rPr>
           <w:rFonts w:ascii="Consolas" w:hAnsi="Consolas" w:cs="Cascadia Mono"/>
-          <w:color w:val="FFE599" w:themeColor="accent4" w:themeTint="66"/>
           <w:sz w:val="22"/>
           <w:szCs w:val="22"/>
         </w:rPr>
@@ -12333,7 +11974,6 @@
       <w:r>
         <w:rPr>
           <w:rFonts w:ascii="Consolas" w:hAnsi="Consolas" w:cs="Cascadia Mono"/>
-          <w:color w:val="FFE599" w:themeColor="accent4" w:themeTint="66"/>
           <w:sz w:val="22"/>
           <w:szCs w:val="22"/>
         </w:rPr>
@@ -12343,7 +11983,6 @@
       <w:r>
         <w:rPr>
           <w:rFonts w:ascii="Consolas" w:hAnsi="Consolas" w:cs="Cascadia Mono"/>
-          <w:color w:val="FFE599" w:themeColor="accent4" w:themeTint="66"/>
           <w:sz w:val="22"/>
           <w:szCs w:val="22"/>
         </w:rPr>
@@ -12353,31 +11992,10 @@
       <w:r>
         <w:rPr>
           <w:rFonts w:ascii="Consolas" w:hAnsi="Consolas" w:cs="Cascadia Mono"/>
-          <w:color w:val="FFE599" w:themeColor="accent4" w:themeTint="66"/>
           <w:sz w:val="22"/>
           <w:szCs w:val="22"/>
         </w:rPr>
-        <w:t xml:space="preserve"> implémenté dans la classe parente. </w:t>
-      </w:r>
-      <w:proofErr w:type="gramStart"/>
-      <w:r>
-        <w:rPr>
-          <w:rFonts w:ascii="Consolas" w:hAnsi="Consolas" w:cs="Cascadia Mono"/>
-          <w:color w:val="FFE599" w:themeColor="accent4" w:themeTint="66"/>
-          <w:sz w:val="22"/>
-          <w:szCs w:val="22"/>
-        </w:rPr>
-        <w:t>*</w:t>
-      </w:r>
-      <w:proofErr w:type="gramEnd"/>
-      <w:r>
-        <w:rPr>
-          <w:rFonts w:ascii="Consolas" w:hAnsi="Consolas" w:cs="Cascadia Mono"/>
-          <w:color w:val="FFE599" w:themeColor="accent4" w:themeTint="66"/>
-          <w:sz w:val="22"/>
-          <w:szCs w:val="22"/>
-        </w:rPr>
-        <w:t>/</w:t>
+        <w:t xml:space="preserve"> implémenté dans la classe parente. */</w:t>
       </w:r>
     </w:p>
     <w:p>
@@ -12395,7 +12013,6 @@
         <w:spacing w:before="0" w:after="0" w:line="240" w:lineRule="auto"/>
         <w:rPr>
           <w:rFonts w:ascii="Consolas" w:hAnsi="Consolas" w:cs="Cascadia Mono"/>
-          <w:color w:val="FFE599" w:themeColor="accent4" w:themeTint="66"/>
           <w:sz w:val="22"/>
           <w:szCs w:val="22"/>
         </w:rPr>
@@ -12403,7 +12020,6 @@
       <w:r>
         <w:rPr>
           <w:rFonts w:ascii="Consolas" w:hAnsi="Consolas" w:cs="Cascadia Mono"/>
-          <w:color w:val="FFE599" w:themeColor="accent4" w:themeTint="66"/>
           <w:sz w:val="22"/>
           <w:szCs w:val="22"/>
         </w:rPr>
@@ -12427,13 +12043,11 @@
         <w:ind w:left="360" w:hanging="360"/>
         <w:rPr>
           <w:rFonts w:ascii="Consolas" w:hAnsi="Consolas"/>
-          <w:color w:val="FFE599" w:themeColor="accent4" w:themeTint="66"/>
         </w:rPr>
       </w:pPr>
       <w:r>
         <w:rPr>
           <w:rFonts w:ascii="Consolas" w:hAnsi="Consolas" w:cs="Cascadia Mono"/>
-          <w:color w:val="FFE599" w:themeColor="accent4" w:themeTint="66"/>
         </w:rPr>
         <w:t>}</w:t>
       </w:r>
@@ -12502,6 +12116,7 @@
       <w:r>
         <w:t xml:space="preserve">un </w:t>
       </w:r>
+      <w:proofErr w:type="spellStart"/>
       <w:r>
         <w:rPr>
           <w:b/>
@@ -12509,6 +12124,7 @@
         </w:rPr>
         <w:t>ZombieType</w:t>
       </w:r>
+      <w:proofErr w:type="spellEnd"/>
       <w:r>
         <w:t xml:space="preserve"> qui contient des </w:t>
       </w:r>
@@ -12589,7 +12205,15 @@
       </w:r>
       <w:proofErr w:type="spellEnd"/>
       <w:r>
-        <w:t xml:space="preserve"> pour les ZombieType non disponible</w:t>
+        <w:t xml:space="preserve"> pour les </w:t>
+      </w:r>
+      <w:proofErr w:type="spellStart"/>
+      <w:r>
+        <w:t>ZombieType</w:t>
+      </w:r>
+      <w:proofErr w:type="spellEnd"/>
+      <w:r>
+        <w:t xml:space="preserve"> non disponible</w:t>
       </w:r>
       <w:r>
         <w:t>s</w:t>
@@ -12822,13 +12446,7 @@
         <w:t>ZombieType</w:t>
       </w:r>
       <w:r>
-        <w:t>).</w:t>
-      </w:r>
-      <w:r>
-        <w:t xml:space="preserve"> </w:t>
-      </w:r>
-      <w:r>
-        <w:t xml:space="preserve">N'oubliez pas de créer </w:t>
+        <w:t xml:space="preserve">). N'oubliez pas de créer </w:t>
       </w:r>
       <w:r>
         <w:rPr>
@@ -12851,19 +12469,7 @@
       </w:r>
       <w:proofErr w:type="spellEnd"/>
       <w:r>
-        <w:t>).</w:t>
-      </w:r>
-      <w:r>
-        <w:t xml:space="preserve"> </w:t>
-      </w:r>
-      <w:r>
-        <w:t>Inspirez-vous du code de</w:t>
-      </w:r>
-      <w:r>
-        <w:t xml:space="preserve"> la </w:t>
-      </w:r>
-      <w:r>
-        <w:t xml:space="preserve">section </w:t>
+        <w:t xml:space="preserve">). Inspirez-vous du code de la section </w:t>
       </w:r>
       <w:r>
         <w:rPr>
@@ -13542,7 +13148,6 @@
         <w:spacing w:before="0" w:after="0" w:line="240" w:lineRule="auto"/>
         <w:rPr>
           <w:rFonts w:ascii="Cascadia Mono" w:hAnsi="Cascadia Mono" w:cs="Cascadia Mono"/>
-          <w:color w:val="FFE599" w:themeColor="accent4" w:themeTint="66"/>
           <w:sz w:val="19"/>
           <w:szCs w:val="19"/>
           <w:lang w:val="en-CA"/>
@@ -13551,7 +13156,6 @@
       <w:r>
         <w:rPr>
           <w:rFonts w:ascii="Cascadia Mono" w:hAnsi="Cascadia Mono" w:cs="Cascadia Mono"/>
-          <w:color w:val="FFE599" w:themeColor="accent4" w:themeTint="66"/>
           <w:sz w:val="19"/>
           <w:szCs w:val="19"/>
           <w:lang w:val="en-CA"/>
@@ -13562,7 +13166,6 @@
       <w:r>
         <w:rPr>
           <w:rFonts w:ascii="Cascadia Mono" w:hAnsi="Cascadia Mono" w:cs="Cascadia Mono"/>
-          <w:color w:val="FFE599" w:themeColor="accent4" w:themeTint="66"/>
           <w:sz w:val="19"/>
           <w:szCs w:val="19"/>
           <w:lang w:val="en-CA"/>
@@ -13573,7 +13176,6 @@
       <w:r>
         <w:rPr>
           <w:rFonts w:ascii="Cascadia Mono" w:hAnsi="Cascadia Mono" w:cs="Cascadia Mono"/>
-          <w:color w:val="FFE599" w:themeColor="accent4" w:themeTint="66"/>
           <w:sz w:val="19"/>
           <w:szCs w:val="19"/>
           <w:lang w:val="en-CA"/>
@@ -13585,7 +13187,6 @@
       <w:r>
         <w:rPr>
           <w:rFonts w:ascii="Cascadia Mono" w:hAnsi="Cascadia Mono" w:cs="Cascadia Mono"/>
-          <w:color w:val="FFE599" w:themeColor="accent4" w:themeTint="66"/>
           <w:sz w:val="19"/>
           <w:szCs w:val="19"/>
           <w:lang w:val="en-CA"/>
@@ -13596,7 +13197,6 @@
       <w:r>
         <w:rPr>
           <w:rFonts w:ascii="Cascadia Mono" w:hAnsi="Cascadia Mono" w:cs="Cascadia Mono"/>
-          <w:color w:val="FFE599" w:themeColor="accent4" w:themeTint="66"/>
           <w:sz w:val="19"/>
           <w:szCs w:val="19"/>
           <w:lang w:val="en-CA"/>
@@ -13607,7 +13207,6 @@
       <w:r>
         <w:rPr>
           <w:rFonts w:ascii="Cascadia Mono" w:hAnsi="Cascadia Mono" w:cs="Cascadia Mono"/>
-          <w:color w:val="FFE599" w:themeColor="accent4" w:themeTint="66"/>
           <w:sz w:val="19"/>
           <w:szCs w:val="19"/>
           <w:lang w:val="en-CA"/>
@@ -13630,7 +13229,6 @@
         <w:spacing w:before="0" w:after="0" w:line="240" w:lineRule="auto"/>
         <w:rPr>
           <w:rFonts w:ascii="Cascadia Mono" w:hAnsi="Cascadia Mono" w:cs="Cascadia Mono"/>
-          <w:color w:val="FFE599" w:themeColor="accent4" w:themeTint="66"/>
           <w:sz w:val="19"/>
           <w:szCs w:val="19"/>
           <w:lang w:val="en-CA"/>
@@ -13639,7 +13237,6 @@
       <w:r>
         <w:rPr>
           <w:rFonts w:ascii="Cascadia Mono" w:hAnsi="Cascadia Mono" w:cs="Cascadia Mono"/>
-          <w:color w:val="FFE599" w:themeColor="accent4" w:themeTint="66"/>
           <w:sz w:val="19"/>
           <w:szCs w:val="19"/>
           <w:lang w:val="en-CA"/>
@@ -13662,7 +13259,6 @@
         <w:spacing w:before="0" w:after="0" w:line="240" w:lineRule="auto"/>
         <w:rPr>
           <w:rFonts w:ascii="Cascadia Mono" w:hAnsi="Cascadia Mono" w:cs="Cascadia Mono"/>
-          <w:color w:val="FFE599" w:themeColor="accent4" w:themeTint="66"/>
           <w:sz w:val="19"/>
           <w:szCs w:val="19"/>
           <w:lang w:val="en-CA"/>
@@ -13671,7 +13267,6 @@
       <w:r>
         <w:rPr>
           <w:rFonts w:ascii="Cascadia Mono" w:hAnsi="Cascadia Mono" w:cs="Cascadia Mono"/>
-          <w:color w:val="FFE599" w:themeColor="accent4" w:themeTint="66"/>
           <w:sz w:val="19"/>
           <w:szCs w:val="19"/>
           <w:lang w:val="en-CA"/>
@@ -13681,7 +13276,6 @@
       <w:r>
         <w:rPr>
           <w:rFonts w:ascii="Cascadia Mono" w:hAnsi="Cascadia Mono" w:cs="Cascadia Mono"/>
-          <w:color w:val="FFE599" w:themeColor="accent4" w:themeTint="66"/>
           <w:sz w:val="19"/>
           <w:szCs w:val="19"/>
           <w:lang w:val="en-CA"/>
@@ -13692,7 +13286,6 @@
       <w:r>
         <w:rPr>
           <w:rFonts w:ascii="Cascadia Mono" w:hAnsi="Cascadia Mono" w:cs="Cascadia Mono"/>
-          <w:color w:val="FFE599" w:themeColor="accent4" w:themeTint="66"/>
           <w:sz w:val="19"/>
           <w:szCs w:val="19"/>
           <w:lang w:val="en-CA"/>
@@ -13703,7 +13296,6 @@
       <w:r>
         <w:rPr>
           <w:rFonts w:ascii="Cascadia Mono" w:hAnsi="Cascadia Mono" w:cs="Cascadia Mono"/>
-          <w:color w:val="FFE599" w:themeColor="accent4" w:themeTint="66"/>
           <w:sz w:val="19"/>
           <w:szCs w:val="19"/>
           <w:lang w:val="en-CA"/>
@@ -13714,7 +13306,6 @@
       <w:r>
         <w:rPr>
           <w:rFonts w:ascii="Cascadia Mono" w:hAnsi="Cascadia Mono" w:cs="Cascadia Mono"/>
-          <w:color w:val="FFE599" w:themeColor="accent4" w:themeTint="66"/>
           <w:sz w:val="19"/>
           <w:szCs w:val="19"/>
           <w:lang w:val="en-CA"/>
@@ -13725,7 +13316,6 @@
       <w:r>
         <w:rPr>
           <w:rFonts w:ascii="Cascadia Mono" w:hAnsi="Cascadia Mono" w:cs="Cascadia Mono"/>
-          <w:color w:val="FFE599" w:themeColor="accent4" w:themeTint="66"/>
           <w:sz w:val="19"/>
           <w:szCs w:val="19"/>
           <w:lang w:val="en-CA"/>
@@ -13737,7 +13327,6 @@
       <w:r>
         <w:rPr>
           <w:rFonts w:ascii="Cascadia Mono" w:hAnsi="Cascadia Mono" w:cs="Cascadia Mono"/>
-          <w:color w:val="FFE599" w:themeColor="accent4" w:themeTint="66"/>
           <w:sz w:val="19"/>
           <w:szCs w:val="19"/>
           <w:lang w:val="en-CA"/>
@@ -13749,7 +13338,6 @@
       <w:r>
         <w:rPr>
           <w:rFonts w:ascii="Cascadia Mono" w:hAnsi="Cascadia Mono" w:cs="Cascadia Mono"/>
-          <w:color w:val="FFE599" w:themeColor="accent4" w:themeTint="66"/>
           <w:sz w:val="19"/>
           <w:szCs w:val="19"/>
           <w:lang w:val="en-CA"/>
@@ -13760,7 +13348,6 @@
       <w:r>
         <w:rPr>
           <w:rFonts w:ascii="Cascadia Mono" w:hAnsi="Cascadia Mono" w:cs="Cascadia Mono"/>
-          <w:color w:val="FFE599" w:themeColor="accent4" w:themeTint="66"/>
           <w:sz w:val="19"/>
           <w:szCs w:val="19"/>
           <w:lang w:val="en-CA"/>
@@ -13771,7 +13358,6 @@
       <w:r>
         <w:rPr>
           <w:rFonts w:ascii="Cascadia Mono" w:hAnsi="Cascadia Mono" w:cs="Cascadia Mono"/>
-          <w:color w:val="FFE599" w:themeColor="accent4" w:themeTint="66"/>
           <w:sz w:val="19"/>
           <w:szCs w:val="19"/>
           <w:lang w:val="en-CA"/>
@@ -13783,7 +13369,6 @@
       <w:r>
         <w:rPr>
           <w:rFonts w:ascii="Cascadia Mono" w:hAnsi="Cascadia Mono" w:cs="Cascadia Mono"/>
-          <w:color w:val="FFE599" w:themeColor="accent4" w:themeTint="66"/>
           <w:sz w:val="19"/>
           <w:szCs w:val="19"/>
           <w:lang w:val="en-CA"/>
@@ -13794,7 +13379,6 @@
       <w:r>
         <w:rPr>
           <w:rFonts w:ascii="Cascadia Mono" w:hAnsi="Cascadia Mono" w:cs="Cascadia Mono"/>
-          <w:color w:val="FFE599" w:themeColor="accent4" w:themeTint="66"/>
           <w:sz w:val="19"/>
           <w:szCs w:val="19"/>
           <w:lang w:val="en-CA"/>
@@ -13805,7 +13389,6 @@
       <w:r>
         <w:rPr>
           <w:rFonts w:ascii="Cascadia Mono" w:hAnsi="Cascadia Mono" w:cs="Cascadia Mono"/>
-          <w:color w:val="FFE599" w:themeColor="accent4" w:themeTint="66"/>
           <w:sz w:val="19"/>
           <w:szCs w:val="19"/>
           <w:lang w:val="en-CA"/>
@@ -13817,7 +13400,6 @@
       <w:r>
         <w:rPr>
           <w:rFonts w:ascii="Cascadia Mono" w:hAnsi="Cascadia Mono" w:cs="Cascadia Mono"/>
-          <w:color w:val="FFE599" w:themeColor="accent4" w:themeTint="66"/>
           <w:sz w:val="19"/>
           <w:szCs w:val="19"/>
           <w:lang w:val="en-CA"/>
@@ -13839,14 +13421,8 @@
           <w:right w:val="single" w:sz="4" w:space="4" w:color="auto"/>
         </w:pBdr>
         <w:shd w:val="clear" w:color="auto" w:fill="FFF2CC" w:themeFill="accent4" w:themeFillTint="33"/>
-        <w:rPr>
-          <w:color w:val="FFE599" w:themeColor="accent4" w:themeTint="66"/>
-        </w:rPr>
-      </w:pPr>
-      <w:r>
-        <w:rPr>
-          <w:color w:val="FFE599" w:themeColor="accent4" w:themeTint="66"/>
-        </w:rPr>
+      </w:pPr>
+      <w:r>
         <w:t>}</w:t>
       </w:r>
     </w:p>
@@ -13912,13 +13488,11 @@
         <w:shd w:val="clear" w:color="auto" w:fill="FFF2CC" w:themeFill="accent4" w:themeFillTint="33"/>
         <w:spacing w:before="0" w:after="0"/>
         <w:rPr>
-          <w:color w:val="FFE599" w:themeColor="accent4" w:themeTint="66"/>
           <w:lang w:val="en-US"/>
         </w:rPr>
       </w:pPr>
       <w:r>
         <w:rPr>
-          <w:color w:val="FFE599" w:themeColor="accent4" w:themeTint="66"/>
           <w:lang w:val="en-US"/>
         </w:rPr>
         <w:t>public async Task&lt;</w:t>
@@ -13926,7 +13500,6 @@
       <w:proofErr w:type="spellStart"/>
       <w:r>
         <w:rPr>
-          <w:color w:val="FFE599" w:themeColor="accent4" w:themeTint="66"/>
           <w:lang w:val="en-US"/>
         </w:rPr>
         <w:t>IActionResult</w:t>
@@ -13934,7 +13507,6 @@
       <w:proofErr w:type="spellEnd"/>
       <w:r>
         <w:rPr>
-          <w:color w:val="FFE599" w:themeColor="accent4" w:themeTint="66"/>
           <w:lang w:val="en-US"/>
         </w:rPr>
         <w:t xml:space="preserve">&gt; </w:t>
@@ -13942,7 +13514,6 @@
       <w:proofErr w:type="gramStart"/>
       <w:r>
         <w:rPr>
-          <w:color w:val="FFE599" w:themeColor="accent4" w:themeTint="66"/>
           <w:lang w:val="en-US"/>
         </w:rPr>
         <w:t>Index(</w:t>
@@ -13950,7 +13521,6 @@
       <w:proofErr w:type="gramEnd"/>
       <w:r>
         <w:rPr>
-          <w:color w:val="FFE599" w:themeColor="accent4" w:themeTint="66"/>
           <w:lang w:val="en-US"/>
         </w:rPr>
         <w:t>)</w:t>
@@ -13972,13 +13542,11 @@
         <w:shd w:val="clear" w:color="auto" w:fill="FFF2CC" w:themeFill="accent4" w:themeFillTint="33"/>
         <w:spacing w:before="0" w:after="0"/>
         <w:rPr>
-          <w:color w:val="FFE599" w:themeColor="accent4" w:themeTint="66"/>
           <w:lang w:val="en-US"/>
         </w:rPr>
       </w:pPr>
       <w:r>
         <w:rPr>
-          <w:color w:val="FFE599" w:themeColor="accent4" w:themeTint="66"/>
           <w:lang w:val="en-US"/>
         </w:rPr>
         <w:t>{</w:t>
@@ -14000,13 +13568,11 @@
         <w:shd w:val="clear" w:color="auto" w:fill="FFF2CC" w:themeFill="accent4" w:themeFillTint="33"/>
         <w:spacing w:before="0" w:after="0"/>
         <w:rPr>
-          <w:color w:val="FFE599" w:themeColor="accent4" w:themeTint="66"/>
           <w:lang w:val="en-US"/>
         </w:rPr>
       </w:pPr>
       <w:r>
         <w:rPr>
-          <w:color w:val="FFE599" w:themeColor="accent4" w:themeTint="66"/>
           <w:lang w:val="en-US"/>
         </w:rPr>
         <w:t xml:space="preserve">    </w:t>
@@ -14014,7 +13580,6 @@
       <w:proofErr w:type="spellStart"/>
       <w:r>
         <w:rPr>
-          <w:color w:val="FFE599" w:themeColor="accent4" w:themeTint="66"/>
           <w:lang w:val="en-US"/>
         </w:rPr>
         <w:t>IReadOnlyList</w:t>
@@ -14022,7 +13587,6 @@
       <w:proofErr w:type="spellEnd"/>
       <w:r>
         <w:rPr>
-          <w:color w:val="FFE599" w:themeColor="accent4" w:themeTint="66"/>
           <w:lang w:val="en-US"/>
         </w:rPr>
         <w:t xml:space="preserve">&lt;Zombie&gt; </w:t>
@@ -14030,7 +13594,6 @@
       <w:proofErr w:type="spellStart"/>
       <w:r>
         <w:rPr>
-          <w:color w:val="FFE599" w:themeColor="accent4" w:themeTint="66"/>
           <w:lang w:val="en-US"/>
         </w:rPr>
         <w:t>zombiesList</w:t>
@@ -14038,7 +13601,6 @@
       <w:proofErr w:type="spellEnd"/>
       <w:r>
         <w:rPr>
-          <w:color w:val="FFE599" w:themeColor="accent4" w:themeTint="66"/>
           <w:lang w:val="en-US"/>
         </w:rPr>
         <w:t xml:space="preserve"> = await _</w:t>
@@ -14046,7 +13608,6 @@
       <w:proofErr w:type="spellStart"/>
       <w:r>
         <w:rPr>
-          <w:color w:val="FFE599" w:themeColor="accent4" w:themeTint="66"/>
           <w:lang w:val="en-US"/>
         </w:rPr>
         <w:t>zombieService.GetAllIndexAsync</w:t>
@@ -14054,7 +13615,6 @@
       <w:proofErr w:type="spellEnd"/>
       <w:r>
         <w:rPr>
-          <w:color w:val="FFE599" w:themeColor="accent4" w:themeTint="66"/>
           <w:lang w:val="en-US"/>
         </w:rPr>
         <w:t>();</w:t>
@@ -14075,43 +13635,35 @@
         </w:pBdr>
         <w:shd w:val="clear" w:color="auto" w:fill="FFF2CC" w:themeFill="accent4" w:themeFillTint="33"/>
         <w:spacing w:before="0" w:after="0"/>
-        <w:rPr>
-          <w:color w:val="FFE599" w:themeColor="accent4" w:themeTint="66"/>
-        </w:rPr>
-      </w:pPr>
-      <w:r>
-        <w:rPr>
-          <w:color w:val="FFE599" w:themeColor="accent4" w:themeTint="66"/>
+      </w:pPr>
+      <w:r>
+        <w:rPr>
           <w:lang w:val="en-US"/>
         </w:rPr>
         <w:t xml:space="preserve">    </w:t>
       </w:r>
       <w:proofErr w:type="gramStart"/>
       <w:r>
-        <w:rPr>
-          <w:color w:val="FFE599" w:themeColor="accent4" w:themeTint="66"/>
-        </w:rPr>
         <w:t>return</w:t>
       </w:r>
       <w:proofErr w:type="gramEnd"/>
       <w:r>
-        <w:rPr>
-          <w:color w:val="FFE599" w:themeColor="accent4" w:themeTint="66"/>
-        </w:rPr>
-        <w:t xml:space="preserve"> View(</w:t>
-      </w:r>
-      <w:proofErr w:type="spellStart"/>
-      <w:r>
-        <w:rPr>
-          <w:color w:val="FFE599" w:themeColor="accent4" w:themeTint="66"/>
-        </w:rPr>
+        <w:t xml:space="preserve"> </w:t>
+      </w:r>
+      <w:proofErr w:type="spellStart"/>
+      <w:r>
+        <w:t>View</w:t>
+      </w:r>
+      <w:proofErr w:type="spellEnd"/>
+      <w:r>
+        <w:t>(</w:t>
+      </w:r>
+      <w:proofErr w:type="spellStart"/>
+      <w:r>
         <w:t>zombiesList</w:t>
       </w:r>
       <w:proofErr w:type="spellEnd"/>
       <w:r>
-        <w:rPr>
-          <w:color w:val="FFE599" w:themeColor="accent4" w:themeTint="66"/>
-        </w:rPr>
         <w:t>);</w:t>
       </w:r>
     </w:p>
@@ -14130,14 +13682,8 @@
         </w:pBdr>
         <w:shd w:val="clear" w:color="auto" w:fill="FFF2CC" w:themeFill="accent4" w:themeFillTint="33"/>
         <w:spacing w:before="0" w:after="0"/>
-        <w:rPr>
-          <w:color w:val="FFE599" w:themeColor="accent4" w:themeTint="66"/>
-        </w:rPr>
-      </w:pPr>
-      <w:r>
-        <w:rPr>
-          <w:color w:val="FFE599" w:themeColor="accent4" w:themeTint="66"/>
-        </w:rPr>
+      </w:pPr>
+      <w:r>
         <w:t>}</w:t>
       </w:r>
     </w:p>
@@ -16200,6 +15746,7 @@
         <w:rPr>
           <w:rFonts w:ascii="Consolas" w:hAnsi="Consolas" w:cs="Cascadia Mono"/>
           <w:color w:val="FFE599" w:themeColor="accent4" w:themeTint="66"/>
+          <w:lang w:val="en-CA"/>
         </w:rPr>
         <w:t xml:space="preserve"> </w:t>
       </w:r>
@@ -16208,6 +15755,7 @@
         <w:rPr>
           <w:rFonts w:ascii="Consolas" w:hAnsi="Consolas" w:cs="Cascadia Mono"/>
           <w:color w:val="FFE599" w:themeColor="accent4" w:themeTint="66"/>
+          <w:lang w:val="en-CA"/>
         </w:rPr>
         <w:t>zombieVM.ZombieTypeSelectList</w:t>
       </w:r>
@@ -16216,6 +15764,7 @@
         <w:rPr>
           <w:rFonts w:ascii="Consolas" w:hAnsi="Consolas" w:cs="Cascadia Mono"/>
           <w:color w:val="FFE599" w:themeColor="accent4" w:themeTint="66"/>
+          <w:lang w:val="en-CA"/>
         </w:rPr>
         <w:t xml:space="preserve"> = _</w:t>
       </w:r>
@@ -16224,6 +15773,7 @@
         <w:rPr>
           <w:rFonts w:ascii="Consolas" w:hAnsi="Consolas" w:cs="Cascadia Mono"/>
           <w:color w:val="FFE599" w:themeColor="accent4" w:themeTint="66"/>
+          <w:lang w:val="en-CA"/>
         </w:rPr>
         <w:t>serviceZT.ListZombieTypeDisponible</w:t>
       </w:r>
@@ -16232,6 +15782,7 @@
         <w:rPr>
           <w:rFonts w:ascii="Consolas" w:hAnsi="Consolas" w:cs="Cascadia Mono"/>
           <w:color w:val="FFE599" w:themeColor="accent4" w:themeTint="66"/>
+          <w:lang w:val="en-CA"/>
         </w:rPr>
         <w:t>();</w:t>
       </w:r>
@@ -16265,6 +15816,7 @@
         <w:rPr>
           <w:rFonts w:ascii="Consolas" w:hAnsi="Consolas" w:cs="Cascadia Mono"/>
           <w:color w:val="FFE599" w:themeColor="accent4" w:themeTint="66"/>
+          <w:lang w:val="en-CA"/>
         </w:rPr>
       </w:pPr>
       <w:r>
@@ -16283,35 +15835,29 @@
         </w:rPr>
         <w:t xml:space="preserve"> </w:t>
       </w:r>
-      <w:proofErr w:type="gramStart"/>
       <w:r>
         <w:rPr>
           <w:rFonts w:ascii="Consolas" w:hAnsi="Consolas" w:cs="Cascadia Mono"/>
           <w:color w:val="FFE599" w:themeColor="accent4" w:themeTint="66"/>
-        </w:rPr>
-        <w:t>return</w:t>
-      </w:r>
-      <w:proofErr w:type="gramEnd"/>
+          <w:lang w:val="en-CA"/>
+        </w:rPr>
+        <w:t>return View(</w:t>
+      </w:r>
+      <w:proofErr w:type="spellStart"/>
       <w:r>
         <w:rPr>
           <w:rFonts w:ascii="Consolas" w:hAnsi="Consolas" w:cs="Cascadia Mono"/>
           <w:color w:val="FFE599" w:themeColor="accent4" w:themeTint="66"/>
-        </w:rPr>
-        <w:t xml:space="preserve"> View(</w:t>
-      </w:r>
-      <w:proofErr w:type="spellStart"/>
+          <w:lang w:val="en-CA"/>
+        </w:rPr>
+        <w:t>zombieVM</w:t>
+      </w:r>
+      <w:proofErr w:type="spellEnd"/>
       <w:r>
         <w:rPr>
           <w:rFonts w:ascii="Consolas" w:hAnsi="Consolas" w:cs="Cascadia Mono"/>
           <w:color w:val="FFE599" w:themeColor="accent4" w:themeTint="66"/>
-        </w:rPr>
-        <w:t>zombieVM</w:t>
-      </w:r>
-      <w:proofErr w:type="spellEnd"/>
-      <w:r>
-        <w:rPr>
-          <w:rFonts w:ascii="Consolas" w:hAnsi="Consolas" w:cs="Cascadia Mono"/>
-          <w:color w:val="FFE599" w:themeColor="accent4" w:themeTint="66"/>
+          <w:lang w:val="en-CA"/>
         </w:rPr>
         <w:t>);</w:t>
       </w:r>
@@ -16337,12 +15883,14 @@
         <w:rPr>
           <w:rFonts w:ascii="Consolas" w:hAnsi="Consolas" w:cs="Cascadia Mono"/>
           <w:color w:val="FFE599" w:themeColor="accent4" w:themeTint="66"/>
+          <w:lang w:val="en-CA"/>
         </w:rPr>
       </w:pPr>
       <w:r>
         <w:rPr>
           <w:rFonts w:ascii="Consolas" w:hAnsi="Consolas" w:cs="Cascadia Mono"/>
           <w:color w:val="FFE599" w:themeColor="accent4" w:themeTint="66"/>
+          <w:lang w:val="en-CA"/>
         </w:rPr>
         <w:t xml:space="preserve">    }</w:t>
       </w:r>
@@ -16368,6 +15916,7 @@
         <w:rPr>
           <w:rFonts w:ascii="Consolas" w:hAnsi="Consolas" w:cs="Cascadia Mono"/>
           <w:color w:val="FFE599" w:themeColor="accent4" w:themeTint="66"/>
+          <w:lang w:val="en-CA"/>
         </w:rPr>
       </w:pPr>
     </w:p>
@@ -16398,6 +15947,7 @@
         <w:rPr>
           <w:rFonts w:ascii="Consolas" w:hAnsi="Consolas" w:cs="Cascadia Mono"/>
           <w:color w:val="FFE599" w:themeColor="accent4" w:themeTint="66"/>
+          <w:lang w:val="en-CA"/>
         </w:rPr>
         <w:t xml:space="preserve">    </w:t>
       </w:r>
@@ -19263,6 +18813,7 @@
   <w:style w:type="character" w:default="1" w:styleId="Policepardfaut">
     <w:name w:val="Default Paragraph Font"/>
     <w:uiPriority w:val="1"/>
+    <w:semiHidden/>
     <w:unhideWhenUsed/>
   </w:style>
   <w:style w:type="table" w:default="1" w:styleId="TableauNormal">
@@ -20278,21 +19829,10 @@
 </file>
 
 <file path=customXml/item1.xml><?xml version="1.0" encoding="utf-8"?>
-<?mso-contentType ?>
-<FormTemplates xmlns="http://schemas.microsoft.com/sharepoint/v3/contenttype/forms">
-  <Display>DocumentLibraryForm</Display>
-  <Edit>DocumentLibraryForm</Edit>
-  <New>DocumentLibraryForm</New>
-</FormTemplates>
+<b:Sources xmlns:b="http://schemas.openxmlformats.org/officeDocument/2006/bibliography" xmlns="http://schemas.openxmlformats.org/officeDocument/2006/bibliography" SelectedStyle="\APASixthEditionOfficeOnline.xsl" StyleName="APA" Version="6"/>
 </file>
 
 <file path=customXml/item2.xml><?xml version="1.0" encoding="utf-8"?>
-<p:properties xmlns:p="http://schemas.microsoft.com/office/2006/metadata/properties" xmlns:xsi="http://www.w3.org/2001/XMLSchema-instance" xmlns:pc="http://schemas.microsoft.com/office/infopath/2007/PartnerControls">
-  <documentManagement/>
-</p:properties>
-</file>
-
-<file path=customXml/item3.xml><?xml version="1.0" encoding="utf-8"?>
 <ct:contentTypeSchema xmlns:ct="http://schemas.microsoft.com/office/2006/metadata/contentType" xmlns:ma="http://schemas.microsoft.com/office/2006/metadata/properties/metaAttributes" ct:_="" ma:_="" ma:contentTypeName="Document" ma:contentTypeID="0x010100354AEAE9FD62D747A26A546E5B1B5735" ma:contentTypeVersion="7" ma:contentTypeDescription="Crée un document." ma:contentTypeScope="" ma:versionID="43b763fe9aa20b7a2976a5e019d82dbf">
   <xsd:schema xmlns:xsd="http://www.w3.org/2001/XMLSchema" xmlns:xs="http://www.w3.org/2001/XMLSchema" xmlns:p="http://schemas.microsoft.com/office/2006/metadata/properties" xmlns:ns2="071933db-0376-4694-9786-b56cb37c4ec2" targetNamespace="http://schemas.microsoft.com/office/2006/metadata/properties" ma:root="true" ma:fieldsID="d5c90ae6c1ec6ed317c9f5feddaf7a33" ns2:_="">
     <xsd:import namespace="071933db-0376-4694-9786-b56cb37c4ec2"/>
@@ -20456,28 +19996,30 @@
 </ct:contentTypeSchema>
 </file>
 
+<file path=customXml/item3.xml><?xml version="1.0" encoding="utf-8"?>
+<p:properties xmlns:p="http://schemas.microsoft.com/office/2006/metadata/properties" xmlns:xsi="http://www.w3.org/2001/XMLSchema-instance" xmlns:pc="http://schemas.microsoft.com/office/infopath/2007/PartnerControls">
+  <documentManagement/>
+</p:properties>
+</file>
+
 <file path=customXml/item4.xml><?xml version="1.0" encoding="utf-8"?>
-<b:Sources xmlns:b="http://schemas.openxmlformats.org/officeDocument/2006/bibliography" xmlns="http://schemas.openxmlformats.org/officeDocument/2006/bibliography" SelectedStyle="\APASixthEditionOfficeOnline.xsl" StyleName="APA" Version="6"/>
+<?mso-contentType ?>
+<FormTemplates xmlns="http://schemas.microsoft.com/sharepoint/v3/contenttype/forms">
+  <Display>DocumentLibraryForm</Display>
+  <Edit>DocumentLibraryForm</Edit>
+  <New>DocumentLibraryForm</New>
+</FormTemplates>
 </file>
 
 <file path=customXml/itemProps1.xml><?xml version="1.0" encoding="utf-8"?>
-<ds:datastoreItem xmlns:ds="http://schemas.openxmlformats.org/officeDocument/2006/customXml" ds:itemID="{F6194C16-5FE5-4670-BEC8-3D6DD9380312}">
+<ds:datastoreItem xmlns:ds="http://schemas.openxmlformats.org/officeDocument/2006/customXml" ds:itemID="{28D15B86-D92D-420E-A893-C7613CFD01AE}">
   <ds:schemaRefs>
-    <ds:schemaRef ds:uri="http://schemas.microsoft.com/sharepoint/v3/contenttype/forms"/>
+    <ds:schemaRef ds:uri="http://schemas.openxmlformats.org/officeDocument/2006/bibliography"/>
   </ds:schemaRefs>
 </ds:datastoreItem>
 </file>
 
 <file path=customXml/itemProps2.xml><?xml version="1.0" encoding="utf-8"?>
-<ds:datastoreItem xmlns:ds="http://schemas.openxmlformats.org/officeDocument/2006/customXml" ds:itemID="{2C36E056-BA2C-4A1F-9580-242C9B36FE70}">
-  <ds:schemaRefs>
-    <ds:schemaRef ds:uri="http://schemas.microsoft.com/office/2006/metadata/properties"/>
-    <ds:schemaRef ds:uri="http://schemas.microsoft.com/office/infopath/2007/PartnerControls"/>
-  </ds:schemaRefs>
-</ds:datastoreItem>
-</file>
-
-<file path=customXml/itemProps3.xml><?xml version="1.0" encoding="utf-8"?>
 <ds:datastoreItem xmlns:ds="http://schemas.openxmlformats.org/officeDocument/2006/customXml" ds:itemID="{5C3A06EC-DC03-4D65-AA15-C6B9D68C1ED0}">
   <ds:schemaRefs>
     <ds:schemaRef ds:uri="http://schemas.microsoft.com/office/2006/metadata/contentType"/>
@@ -20495,10 +20037,19 @@
 </ds:datastoreItem>
 </file>
 
+<file path=customXml/itemProps3.xml><?xml version="1.0" encoding="utf-8"?>
+<ds:datastoreItem xmlns:ds="http://schemas.openxmlformats.org/officeDocument/2006/customXml" ds:itemID="{2C36E056-BA2C-4A1F-9580-242C9B36FE70}">
+  <ds:schemaRefs>
+    <ds:schemaRef ds:uri="http://schemas.microsoft.com/office/2006/metadata/properties"/>
+    <ds:schemaRef ds:uri="http://schemas.microsoft.com/office/infopath/2007/PartnerControls"/>
+  </ds:schemaRefs>
+</ds:datastoreItem>
+</file>
+
 <file path=customXml/itemProps4.xml><?xml version="1.0" encoding="utf-8"?>
-<ds:datastoreItem xmlns:ds="http://schemas.openxmlformats.org/officeDocument/2006/customXml" ds:itemID="{28D15B86-D92D-420E-A893-C7613CFD01AE}">
+<ds:datastoreItem xmlns:ds="http://schemas.openxmlformats.org/officeDocument/2006/customXml" ds:itemID="{F6194C16-5FE5-4670-BEC8-3D6DD9380312}">
   <ds:schemaRefs>
-    <ds:schemaRef ds:uri="http://schemas.openxmlformats.org/officeDocument/2006/bibliography"/>
+    <ds:schemaRef ds:uri="http://schemas.microsoft.com/sharepoint/v3/contenttype/forms"/>
   </ds:schemaRefs>
 </ds:datastoreItem>
 </file>
</xml_diff>